<commit_message>
fixed 4 to i3 and i8
</commit_message>
<xml_diff>
--- a/docs/ecostats_lectures/lecture_04/04_01_lecture_powerpoint.docx
+++ b/docs/ecostats_lectures/lecture_04/04_01_lecture_powerpoint.docx
@@ -951,13 +951,13 @@
       </w:r>
     </w:p>
     <w:bookmarkEnd w:id="36"/>
-    <w:bookmarkStart w:id="39" w:name="practice-exercise-2-calculating-z-scores"/>
+    <w:bookmarkStart w:id="39" w:name="X036783e2982a7d254cea35a1058d9e9a70a51fb"/>
     <w:p>
       <w:pPr>
         <w:pStyle w:val="Heading1"/>
       </w:pPr>
       <w:r>
-        <w:t xml:space="preserve">Practice Exercise 2: Calculating Z-scores</w:t>
+        <w:t xml:space="preserve">Practice Exercise 2: Calculating Z-scores of lake I3</w:t>
       </w:r>
     </w:p>
     <w:tbl>
@@ -1081,274 +1081,10 @@
           </w:p>
           <w:p>
             <w:pPr>
-              <w:pStyle w:val="SourceCode"/>
+              <w:pStyle w:val="BodyText"/>
             </w:pPr>
             <w:r>
-              <w:rPr>
-                <w:rStyle w:val="CommentTok"/>
-              </w:rPr>
-              <w:t xml:space="preserve"># Calculate the mean and standard deviation of fish lengths</w:t>
-            </w:r>
-            <w:r>
-              <w:br/>
-            </w:r>
-            <w:r>
-              <w:rPr>
-                <w:rStyle w:val="NormalTok"/>
-              </w:rPr>
-              <w:t xml:space="preserve">mean_length </w:t>
-            </w:r>
-            <w:r>
-              <w:rPr>
-                <w:rStyle w:val="OtherTok"/>
-              </w:rPr>
-              <w:t xml:space="preserve">&lt;-</w:t>
-            </w:r>
-            <w:r>
-              <w:rPr>
-                <w:rStyle w:val="NormalTok"/>
-              </w:rPr>
-              <w:t xml:space="preserve"> </w:t>
-            </w:r>
-            <w:r>
-              <w:rPr>
-                <w:rStyle w:val="FunctionTok"/>
-              </w:rPr>
-              <w:t xml:space="preserve">mean</w:t>
-            </w:r>
-            <w:r>
-              <w:rPr>
-                <w:rStyle w:val="NormalTok"/>
-              </w:rPr>
-              <w:t xml:space="preserve">(grayling_df</w:t>
-            </w:r>
-            <w:r>
-              <w:rPr>
-                <w:rStyle w:val="SpecialCharTok"/>
-              </w:rPr>
-              <w:t xml:space="preserve">$</w:t>
-            </w:r>
-            <w:r>
-              <w:rPr>
-                <w:rStyle w:val="NormalTok"/>
-              </w:rPr>
-              <w:t xml:space="preserve">length_mm, </w:t>
-            </w:r>
-            <w:r>
-              <w:rPr>
-                <w:rStyle w:val="AttributeTok"/>
-              </w:rPr>
-              <w:t xml:space="preserve">na.rm =</w:t>
-            </w:r>
-            <w:r>
-              <w:rPr>
-                <w:rStyle w:val="NormalTok"/>
-              </w:rPr>
-              <w:t xml:space="preserve"> </w:t>
-            </w:r>
-            <w:r>
-              <w:rPr>
-                <w:rStyle w:val="ConstantTok"/>
-              </w:rPr>
-              <w:t xml:space="preserve">TRUE</w:t>
-            </w:r>
-            <w:r>
-              <w:rPr>
-                <w:rStyle w:val="NormalTok"/>
-              </w:rPr>
-              <w:t xml:space="preserve">)</w:t>
-            </w:r>
-            <w:r>
-              <w:br/>
-            </w:r>
-            <w:r>
-              <w:rPr>
-                <w:rStyle w:val="NormalTok"/>
-              </w:rPr>
-              <w:t xml:space="preserve">sd_length </w:t>
-            </w:r>
-            <w:r>
-              <w:rPr>
-                <w:rStyle w:val="OtherTok"/>
-              </w:rPr>
-              <w:t xml:space="preserve">&lt;-</w:t>
-            </w:r>
-            <w:r>
-              <w:rPr>
-                <w:rStyle w:val="NormalTok"/>
-              </w:rPr>
-              <w:t xml:space="preserve"> </w:t>
-            </w:r>
-            <w:r>
-              <w:rPr>
-                <w:rStyle w:val="FunctionTok"/>
-              </w:rPr>
-              <w:t xml:space="preserve">sd</w:t>
-            </w:r>
-            <w:r>
-              <w:rPr>
-                <w:rStyle w:val="NormalTok"/>
-              </w:rPr>
-              <w:t xml:space="preserve">(grayling_df</w:t>
-            </w:r>
-            <w:r>
-              <w:rPr>
-                <w:rStyle w:val="SpecialCharTok"/>
-              </w:rPr>
-              <w:t xml:space="preserve">$</w:t>
-            </w:r>
-            <w:r>
-              <w:rPr>
-                <w:rStyle w:val="NormalTok"/>
-              </w:rPr>
-              <w:t xml:space="preserve">length_mm, </w:t>
-            </w:r>
-            <w:r>
-              <w:rPr>
-                <w:rStyle w:val="AttributeTok"/>
-              </w:rPr>
-              <w:t xml:space="preserve">na.rm =</w:t>
-            </w:r>
-            <w:r>
-              <w:rPr>
-                <w:rStyle w:val="NormalTok"/>
-              </w:rPr>
-              <w:t xml:space="preserve"> </w:t>
-            </w:r>
-            <w:r>
-              <w:rPr>
-                <w:rStyle w:val="ConstantTok"/>
-              </w:rPr>
-              <w:t xml:space="preserve">TRUE</w:t>
-            </w:r>
-            <w:r>
-              <w:rPr>
-                <w:rStyle w:val="NormalTok"/>
-              </w:rPr>
-              <w:t xml:space="preserve">)</w:t>
-            </w:r>
-            <w:r>
-              <w:br/>
-            </w:r>
-            <w:r>
-              <w:br/>
-            </w:r>
-            <w:r>
-              <w:rPr>
-                <w:rStyle w:val="CommentTok"/>
-              </w:rPr>
-              <w:t xml:space="preserve"># Calculate Z-scores for fish lengths</w:t>
-            </w:r>
-            <w:r>
-              <w:br/>
-            </w:r>
-            <w:r>
-              <w:rPr>
-                <w:rStyle w:val="NormalTok"/>
-              </w:rPr>
-              <w:t xml:space="preserve">grayling_df </w:t>
-            </w:r>
-            <w:r>
-              <w:rPr>
-                <w:rStyle w:val="OtherTok"/>
-              </w:rPr>
-              <w:t xml:space="preserve">&lt;-</w:t>
-            </w:r>
-            <w:r>
-              <w:rPr>
-                <w:rStyle w:val="NormalTok"/>
-              </w:rPr>
-              <w:t xml:space="preserve"> grayling_df </w:t>
-            </w:r>
-            <w:r>
-              <w:rPr>
-                <w:rStyle w:val="SpecialCharTok"/>
-              </w:rPr>
-              <w:t xml:space="preserve">%&gt;%</w:t>
-            </w:r>
-            <w:r>
-              <w:br/>
-            </w:r>
-            <w:r>
-              <w:rPr>
-                <w:rStyle w:val="NormalTok"/>
-              </w:rPr>
-              <w:t xml:space="preserve">  </w:t>
-            </w:r>
-            <w:r>
-              <w:rPr>
-                <w:rStyle w:val="FunctionTok"/>
-              </w:rPr>
-              <w:t xml:space="preserve">mutate</w:t>
-            </w:r>
-            <w:r>
-              <w:rPr>
-                <w:rStyle w:val="NormalTok"/>
-              </w:rPr>
-              <w:t xml:space="preserve">(</w:t>
-            </w:r>
-            <w:r>
-              <w:rPr>
-                <w:rStyle w:val="AttributeTok"/>
-              </w:rPr>
-              <w:t xml:space="preserve">z_score =</w:t>
-            </w:r>
-            <w:r>
-              <w:rPr>
-                <w:rStyle w:val="NormalTok"/>
-              </w:rPr>
-              <w:t xml:space="preserve"> (length_mm </w:t>
-            </w:r>
-            <w:r>
-              <w:rPr>
-                <w:rStyle w:val="SpecialCharTok"/>
-              </w:rPr>
-              <w:t xml:space="preserve">-</w:t>
-            </w:r>
-            <w:r>
-              <w:rPr>
-                <w:rStyle w:val="NormalTok"/>
-              </w:rPr>
-              <w:t xml:space="preserve"> mean_length) </w:t>
-            </w:r>
-            <w:r>
-              <w:rPr>
-                <w:rStyle w:val="SpecialCharTok"/>
-              </w:rPr>
-              <w:t xml:space="preserve">/</w:t>
-            </w:r>
-            <w:r>
-              <w:rPr>
-                <w:rStyle w:val="NormalTok"/>
-              </w:rPr>
-              <w:t xml:space="preserve"> sd_length)</w:t>
-            </w:r>
-            <w:r>
-              <w:br/>
-            </w:r>
-            <w:r>
-              <w:br/>
-            </w:r>
-            <w:r>
-              <w:rPr>
-                <w:rStyle w:val="CommentTok"/>
-              </w:rPr>
-              <w:t xml:space="preserve"># View the first few rows with Z-scores</w:t>
-            </w:r>
-            <w:r>
-              <w:br/>
-            </w:r>
-            <w:r>
-              <w:rPr>
-                <w:rStyle w:val="FunctionTok"/>
-              </w:rPr>
-              <w:t xml:space="preserve">head</w:t>
-            </w:r>
-            <w:r>
-              <w:rPr>
-                <w:rStyle w:val="NormalTok"/>
-              </w:rPr>
-              <w:t xml:space="preserve">(grayling_df)</w:t>
+              <w:t xml:space="preserve">Z Score = (length - mean) / standard deviation</w:t>
             </w:r>
           </w:p>
           <w:p>
@@ -1357,6 +1093,278 @@
             </w:pPr>
             <w:r>
               <w:rPr>
+                <w:rStyle w:val="CommentTok"/>
+              </w:rPr>
+              <w:t xml:space="preserve"># Calculate the mean and standard deviation of fish lengths</w:t>
+            </w:r>
+            <w:r>
+              <w:br/>
+            </w:r>
+            <w:r>
+              <w:rPr>
+                <w:rStyle w:val="NormalTok"/>
+              </w:rPr>
+              <w:t xml:space="preserve">mean_length </w:t>
+            </w:r>
+            <w:r>
+              <w:rPr>
+                <w:rStyle w:val="OtherTok"/>
+              </w:rPr>
+              <w:t xml:space="preserve">&lt;-</w:t>
+            </w:r>
+            <w:r>
+              <w:rPr>
+                <w:rStyle w:val="NormalTok"/>
+              </w:rPr>
+              <w:t xml:space="preserve"> </w:t>
+            </w:r>
+            <w:r>
+              <w:rPr>
+                <w:rStyle w:val="FunctionTok"/>
+              </w:rPr>
+              <w:t xml:space="preserve">mean</w:t>
+            </w:r>
+            <w:r>
+              <w:rPr>
+                <w:rStyle w:val="NormalTok"/>
+              </w:rPr>
+              <w:t xml:space="preserve">(i3_df</w:t>
+            </w:r>
+            <w:r>
+              <w:rPr>
+                <w:rStyle w:val="SpecialCharTok"/>
+              </w:rPr>
+              <w:t xml:space="preserve">$</w:t>
+            </w:r>
+            <w:r>
+              <w:rPr>
+                <w:rStyle w:val="NormalTok"/>
+              </w:rPr>
+              <w:t xml:space="preserve">length_mm, </w:t>
+            </w:r>
+            <w:r>
+              <w:rPr>
+                <w:rStyle w:val="AttributeTok"/>
+              </w:rPr>
+              <w:t xml:space="preserve">na.rm =</w:t>
+            </w:r>
+            <w:r>
+              <w:rPr>
+                <w:rStyle w:val="NormalTok"/>
+              </w:rPr>
+              <w:t xml:space="preserve"> </w:t>
+            </w:r>
+            <w:r>
+              <w:rPr>
+                <w:rStyle w:val="ConstantTok"/>
+              </w:rPr>
+              <w:t xml:space="preserve">TRUE</w:t>
+            </w:r>
+            <w:r>
+              <w:rPr>
+                <w:rStyle w:val="NormalTok"/>
+              </w:rPr>
+              <w:t xml:space="preserve">)</w:t>
+            </w:r>
+            <w:r>
+              <w:br/>
+            </w:r>
+            <w:r>
+              <w:rPr>
+                <w:rStyle w:val="NormalTok"/>
+              </w:rPr>
+              <w:t xml:space="preserve">sd_length </w:t>
+            </w:r>
+            <w:r>
+              <w:rPr>
+                <w:rStyle w:val="OtherTok"/>
+              </w:rPr>
+              <w:t xml:space="preserve">&lt;-</w:t>
+            </w:r>
+            <w:r>
+              <w:rPr>
+                <w:rStyle w:val="NormalTok"/>
+              </w:rPr>
+              <w:t xml:space="preserve"> </w:t>
+            </w:r>
+            <w:r>
+              <w:rPr>
+                <w:rStyle w:val="FunctionTok"/>
+              </w:rPr>
+              <w:t xml:space="preserve">sd</w:t>
+            </w:r>
+            <w:r>
+              <w:rPr>
+                <w:rStyle w:val="NormalTok"/>
+              </w:rPr>
+              <w:t xml:space="preserve">(i3_df</w:t>
+            </w:r>
+            <w:r>
+              <w:rPr>
+                <w:rStyle w:val="SpecialCharTok"/>
+              </w:rPr>
+              <w:t xml:space="preserve">$</w:t>
+            </w:r>
+            <w:r>
+              <w:rPr>
+                <w:rStyle w:val="NormalTok"/>
+              </w:rPr>
+              <w:t xml:space="preserve">length_mm, </w:t>
+            </w:r>
+            <w:r>
+              <w:rPr>
+                <w:rStyle w:val="AttributeTok"/>
+              </w:rPr>
+              <w:t xml:space="preserve">na.rm =</w:t>
+            </w:r>
+            <w:r>
+              <w:rPr>
+                <w:rStyle w:val="NormalTok"/>
+              </w:rPr>
+              <w:t xml:space="preserve"> </w:t>
+            </w:r>
+            <w:r>
+              <w:rPr>
+                <w:rStyle w:val="ConstantTok"/>
+              </w:rPr>
+              <w:t xml:space="preserve">TRUE</w:t>
+            </w:r>
+            <w:r>
+              <w:rPr>
+                <w:rStyle w:val="NormalTok"/>
+              </w:rPr>
+              <w:t xml:space="preserve">)</w:t>
+            </w:r>
+            <w:r>
+              <w:br/>
+            </w:r>
+            <w:r>
+              <w:br/>
+            </w:r>
+            <w:r>
+              <w:rPr>
+                <w:rStyle w:val="CommentTok"/>
+              </w:rPr>
+              <w:t xml:space="preserve"># Calculate Z-scores for fish lengths</w:t>
+            </w:r>
+            <w:r>
+              <w:br/>
+            </w:r>
+            <w:r>
+              <w:rPr>
+                <w:rStyle w:val="NormalTok"/>
+              </w:rPr>
+              <w:t xml:space="preserve">i3_df </w:t>
+            </w:r>
+            <w:r>
+              <w:rPr>
+                <w:rStyle w:val="OtherTok"/>
+              </w:rPr>
+              <w:t xml:space="preserve">&lt;-</w:t>
+            </w:r>
+            <w:r>
+              <w:rPr>
+                <w:rStyle w:val="NormalTok"/>
+              </w:rPr>
+              <w:t xml:space="preserve"> i3_df </w:t>
+            </w:r>
+            <w:r>
+              <w:rPr>
+                <w:rStyle w:val="SpecialCharTok"/>
+              </w:rPr>
+              <w:t xml:space="preserve">%&gt;%</w:t>
+            </w:r>
+            <w:r>
+              <w:br/>
+            </w:r>
+            <w:r>
+              <w:rPr>
+                <w:rStyle w:val="NormalTok"/>
+              </w:rPr>
+              <w:t xml:space="preserve">  </w:t>
+            </w:r>
+            <w:r>
+              <w:rPr>
+                <w:rStyle w:val="FunctionTok"/>
+              </w:rPr>
+              <w:t xml:space="preserve">mutate</w:t>
+            </w:r>
+            <w:r>
+              <w:rPr>
+                <w:rStyle w:val="NormalTok"/>
+              </w:rPr>
+              <w:t xml:space="preserve">(</w:t>
+            </w:r>
+            <w:r>
+              <w:rPr>
+                <w:rStyle w:val="AttributeTok"/>
+              </w:rPr>
+              <w:t xml:space="preserve">z_score =</w:t>
+            </w:r>
+            <w:r>
+              <w:rPr>
+                <w:rStyle w:val="NormalTok"/>
+              </w:rPr>
+              <w:t xml:space="preserve"> (length_mm </w:t>
+            </w:r>
+            <w:r>
+              <w:rPr>
+                <w:rStyle w:val="SpecialCharTok"/>
+              </w:rPr>
+              <w:t xml:space="preserve">-</w:t>
+            </w:r>
+            <w:r>
+              <w:rPr>
+                <w:rStyle w:val="NormalTok"/>
+              </w:rPr>
+              <w:t xml:space="preserve"> mean_length) </w:t>
+            </w:r>
+            <w:r>
+              <w:rPr>
+                <w:rStyle w:val="SpecialCharTok"/>
+              </w:rPr>
+              <w:t xml:space="preserve">/</w:t>
+            </w:r>
+            <w:r>
+              <w:rPr>
+                <w:rStyle w:val="NormalTok"/>
+              </w:rPr>
+              <w:t xml:space="preserve"> sd_length)</w:t>
+            </w:r>
+            <w:r>
+              <w:br/>
+            </w:r>
+            <w:r>
+              <w:br/>
+            </w:r>
+            <w:r>
+              <w:rPr>
+                <w:rStyle w:val="CommentTok"/>
+              </w:rPr>
+              <w:t xml:space="preserve"># View the first few rows with Z-scores</w:t>
+            </w:r>
+            <w:r>
+              <w:br/>
+            </w:r>
+            <w:r>
+              <w:rPr>
+                <w:rStyle w:val="FunctionTok"/>
+              </w:rPr>
+              <w:t xml:space="preserve">head</w:t>
+            </w:r>
+            <w:r>
+              <w:rPr>
+                <w:rStyle w:val="NormalTok"/>
+              </w:rPr>
+              <w:t xml:space="preserve">(i3_df)</w:t>
+            </w:r>
+          </w:p>
+          <w:p>
+            <w:pPr>
+              <w:pStyle w:val="SourceCode"/>
+            </w:pPr>
+            <w:r>
+              <w:rPr>
                 <w:rStyle w:val="VerbatimChar"/>
               </w:rPr>
               <w:t xml:space="preserve"># A tibble: 6 × 6</w:t>
@@ -1386,7 +1394,7 @@
               <w:rPr>
                 <w:rStyle w:val="VerbatimChar"/>
               </w:rPr>
-              <w:t xml:space="preserve">1   113 I3    arctic grayling       266    135  -0.900</w:t>
+              <w:t xml:space="preserve">1   113 I3    arctic grayling       266    135  0.0139</w:t>
             </w:r>
             <w:r>
               <w:br/>
@@ -1395,7 +1403,7 @@
               <w:rPr>
                 <w:rStyle w:val="VerbatimChar"/>
               </w:rPr>
-              <w:t xml:space="preserve">2   113 I3    arctic grayling       290    185  -0.531</w:t>
+              <w:t xml:space="preserve">2   113 I3    arctic grayling       290    185  0.862 </w:t>
             </w:r>
             <w:r>
               <w:br/>
@@ -1404,7 +1412,7 @@
               <w:rPr>
                 <w:rStyle w:val="VerbatimChar"/>
               </w:rPr>
-              <w:t xml:space="preserve">3   113 I3    arctic grayling       262    145  -0.961</w:t>
+              <w:t xml:space="preserve">3   113 I3    arctic grayling       262    145 -0.127 </w:t>
             </w:r>
             <w:r>
               <w:br/>
@@ -1413,7 +1421,7 @@
               <w:rPr>
                 <w:rStyle w:val="VerbatimChar"/>
               </w:rPr>
-              <w:t xml:space="preserve">4   113 I3    arctic grayling       275    160  -0.761</w:t>
+              <w:t xml:space="preserve">4   113 I3    arctic grayling       275    160  0.332 </w:t>
             </w:r>
             <w:r>
               <w:br/>
@@ -1422,7 +1430,7 @@
               <w:rPr>
                 <w:rStyle w:val="VerbatimChar"/>
               </w:rPr>
-              <w:t xml:space="preserve">5   113 I3    arctic grayling       240    105  -1.30 </w:t>
+              <w:t xml:space="preserve">5   113 I3    arctic grayling       240    105 -0.905 </w:t>
             </w:r>
             <w:r>
               <w:br/>
@@ -1431,7 +1439,7 @@
               <w:rPr>
                 <w:rStyle w:val="VerbatimChar"/>
               </w:rPr>
-              <w:t xml:space="preserve">6   113 I3    arctic grayling       265    145  -0.915</w:t>
+              <w:t xml:space="preserve">6   113 I3    arctic grayling       265    145 -0.0214</w:t>
             </w:r>
           </w:p>
         </w:tc>
@@ -1449,6 +1457,34 @@
     </w:p>
     <w:p>
       <w:pPr>
+        <w:pStyle w:val="FirstParagraph"/>
+      </w:pPr>
+      <w:r>
+        <w:t xml:space="preserve">proportion within 1 standard deviation = sum of absolute values of Z</w:t>
+      </w:r>
+      <w:r>
+        <w:t xml:space="preserve"> </w:t>
+      </w:r>
+      <w:r>
+        <w:t xml:space="preserve">Scores that are less than or equal to 1 divided by the number in the</w:t>
+      </w:r>
+      <w:r>
+        <w:t xml:space="preserve"> </w:t>
+      </w:r>
+      <w:r>
+        <w:t xml:space="preserve">sample…</w:t>
+      </w:r>
+    </w:p>
+    <w:p>
+      <w:pPr>
+        <w:pStyle w:val="BodyText"/>
+      </w:pPr>
+      <w:r>
+        <w:t xml:space="preserve">Remember in a true normal distribution it is 68% within 1 std dev.</w:t>
+      </w:r>
+    </w:p>
+    <w:p>
+      <w:pPr>
         <w:pStyle w:val="SourceCode"/>
       </w:pPr>
       <w:r>
@@ -1500,7 +1536,7 @@
         <w:rPr>
           <w:rStyle w:val="NormalTok"/>
         </w:rPr>
-        <w:t xml:space="preserve">(grayling_df</w:t>
+        <w:t xml:space="preserve">(i3_df</w:t>
       </w:r>
       <w:r>
         <w:rPr>
@@ -1602,7 +1638,7 @@
         <w:rPr>
           <w:rStyle w:val="NormalTok"/>
         </w:rPr>
-        <w:t xml:space="preserve">(grayling_df</w:t>
+        <w:t xml:space="preserve">(i3_df</w:t>
       </w:r>
       <w:r>
         <w:rPr>
@@ -1724,7 +1760,7 @@
         <w:rPr>
           <w:rStyle w:val="VerbatimChar"/>
         </w:rPr>
-        <w:t xml:space="preserve">Proportion within 1 SD: 64.3 %</w:t>
+        <w:t xml:space="preserve">Proportion within 1 SD: 81.8 %</w:t>
       </w:r>
     </w:p>
     <w:bookmarkEnd w:id="40"/>
@@ -1766,7 +1802,7 @@
         </w:numPr>
       </w:pPr>
       <w:r>
-        <w:t xml:space="preserve">Can solve this by integrating under curve</w:t>
+        <w:t xml:space="preserve">Can solve this by integrating the area under curve</w:t>
       </w:r>
     </w:p>
     <w:p>
@@ -1819,6 +1855,18 @@
       </w:r>
       <w:r>
         <w:t xml:space="preserve">(SND)</w:t>
+      </w:r>
+    </w:p>
+    <w:p>
+      <w:pPr>
+        <w:pStyle w:val="Compact"/>
+        <w:numPr>
+          <w:ilvl w:val="1"/>
+          <w:numId w:val="1006"/>
+        </w:numPr>
+      </w:pPr>
+      <w:r>
+        <w:t xml:space="preserve">and can use the proportions from the density curve</w:t>
       </w:r>
     </w:p>
     <w:p>
@@ -2210,6 +2258,588 @@
       </w:r>
     </w:p>
     <w:bookmarkStart w:id="53" w:name="textz-fracx_i-musigma"/>
+    <w:p>
+      <w:pPr>
+        <w:pStyle w:val="Heading2"/>
+      </w:pPr>
+      <m:oMath>
+        <m:r>
+          <m:rPr>
+            <m:nor/>
+            <m:sty m:val="p"/>
+          </m:rPr>
+          <m:t>Z = </m:t>
+        </m:r>
+        <m:f>
+          <m:fPr>
+            <m:type m:val="bar"/>
+          </m:fPr>
+          <m:num>
+            <m:sSub>
+              <m:e>
+                <m:r>
+                  <m:t>x</m:t>
+                </m:r>
+              </m:e>
+              <m:sub>
+                <m:r>
+                  <m:t>i</m:t>
+                </m:r>
+              </m:sub>
+            </m:sSub>
+            <m:r>
+              <m:rPr>
+                <m:sty m:val="p"/>
+              </m:rPr>
+              <m:t>−</m:t>
+            </m:r>
+            <m:r>
+              <m:t>μ</m:t>
+            </m:r>
+          </m:num>
+          <m:den>
+            <m:r>
+              <m:t>σ</m:t>
+            </m:r>
+          </m:den>
+        </m:f>
+      </m:oMath>
+    </w:p>
+    <w:p>
+      <w:pPr>
+        <w:pStyle w:val="Compact"/>
+        <w:numPr>
+          <w:ilvl w:val="0"/>
+          <w:numId w:val="1012"/>
+        </w:numPr>
+      </w:pPr>
+      <w:r>
+        <w:t xml:space="preserve">z = z-score for observation</w:t>
+      </w:r>
+    </w:p>
+    <w:p>
+      <w:pPr>
+        <w:pStyle w:val="Compact"/>
+        <w:numPr>
+          <w:ilvl w:val="0"/>
+          <w:numId w:val="1012"/>
+        </w:numPr>
+      </w:pPr>
+      <w:r>
+        <w:t xml:space="preserve">xi = original observation</w:t>
+      </w:r>
+    </w:p>
+    <w:p>
+      <w:pPr>
+        <w:pStyle w:val="Compact"/>
+        <w:numPr>
+          <w:ilvl w:val="0"/>
+          <w:numId w:val="1012"/>
+        </w:numPr>
+      </w:pPr>
+      <w:r>
+        <w:t xml:space="preserve">µ = mean of data distribution</w:t>
+      </w:r>
+    </w:p>
+    <w:p>
+      <w:pPr>
+        <w:pStyle w:val="Compact"/>
+        <w:numPr>
+          <w:ilvl w:val="0"/>
+          <w:numId w:val="1012"/>
+        </w:numPr>
+      </w:pPr>
+      <w:r>
+        <w:t xml:space="preserve">σ = SD of data distribution</w:t>
+      </w:r>
+    </w:p>
+    <w:p>
+      <w:pPr>
+        <w:pStyle w:val="FirstParagraph"/>
+      </w:pPr>
+      <w:r>
+        <w:t xml:space="preserve">So lets do this for a fish that is 300mm long and guess the probability</w:t>
+      </w:r>
+      <w:r>
+        <w:t xml:space="preserve"> </w:t>
+      </w:r>
+      <w:r>
+        <w:t xml:space="preserve">of catching something larger</w:t>
+      </w:r>
+    </w:p>
+    <w:p>
+      <w:pPr>
+        <w:pStyle w:val="BodyText"/>
+      </w:pPr>
+      <w:r>
+        <w:t xml:space="preserve">z = (300 - 265.61)/28.3 = 1.215194</w:t>
+      </w:r>
+    </w:p>
+    <w:bookmarkEnd w:id="53"/>
+    <w:p>
+      <w:pPr>
+        <w:pStyle w:val="SourceCode"/>
+      </w:pPr>
+      <w:r>
+        <w:rPr>
+          <w:rStyle w:val="NormalTok"/>
+        </w:rPr>
+        <w:t xml:space="preserve">i3_stats </w:t>
+      </w:r>
+      <w:r>
+        <w:rPr>
+          <w:rStyle w:val="OtherTok"/>
+        </w:rPr>
+        <w:t xml:space="preserve">&lt;-</w:t>
+      </w:r>
+      <w:r>
+        <w:rPr>
+          <w:rStyle w:val="NormalTok"/>
+        </w:rPr>
+        <w:t xml:space="preserve"> i3_df </w:t>
+      </w:r>
+      <w:r>
+        <w:rPr>
+          <w:rStyle w:val="SpecialCharTok"/>
+        </w:rPr>
+        <w:t xml:space="preserve">%&gt;%</w:t>
+      </w:r>
+      <w:r>
+        <w:br/>
+      </w:r>
+      <w:r>
+        <w:rPr>
+          <w:rStyle w:val="NormalTok"/>
+        </w:rPr>
+        <w:t xml:space="preserve">  </w:t>
+      </w:r>
+      <w:r>
+        <w:rPr>
+          <w:rStyle w:val="FunctionTok"/>
+        </w:rPr>
+        <w:t xml:space="preserve">summarize</w:t>
+      </w:r>
+      <w:r>
+        <w:rPr>
+          <w:rStyle w:val="NormalTok"/>
+        </w:rPr>
+        <w:t xml:space="preserve">(</w:t>
+      </w:r>
+      <w:r>
+        <w:br/>
+      </w:r>
+      <w:r>
+        <w:rPr>
+          <w:rStyle w:val="NormalTok"/>
+        </w:rPr>
+        <w:t xml:space="preserve">    </w:t>
+      </w:r>
+      <w:r>
+        <w:rPr>
+          <w:rStyle w:val="AttributeTok"/>
+        </w:rPr>
+        <w:t xml:space="preserve">mean_length =</w:t>
+      </w:r>
+      <w:r>
+        <w:rPr>
+          <w:rStyle w:val="NormalTok"/>
+        </w:rPr>
+        <w:t xml:space="preserve"> </w:t>
+      </w:r>
+      <w:r>
+        <w:rPr>
+          <w:rStyle w:val="FunctionTok"/>
+        </w:rPr>
+        <w:t xml:space="preserve">round</w:t>
+      </w:r>
+      <w:r>
+        <w:rPr>
+          <w:rStyle w:val="NormalTok"/>
+        </w:rPr>
+        <w:t xml:space="preserve">(</w:t>
+      </w:r>
+      <w:r>
+        <w:rPr>
+          <w:rStyle w:val="FunctionTok"/>
+        </w:rPr>
+        <w:t xml:space="preserve">mean</w:t>
+      </w:r>
+      <w:r>
+        <w:rPr>
+          <w:rStyle w:val="NormalTok"/>
+        </w:rPr>
+        <w:t xml:space="preserve">(length_mm, </w:t>
+      </w:r>
+      <w:r>
+        <w:rPr>
+          <w:rStyle w:val="AttributeTok"/>
+        </w:rPr>
+        <w:t xml:space="preserve">na.rm =</w:t>
+      </w:r>
+      <w:r>
+        <w:rPr>
+          <w:rStyle w:val="NormalTok"/>
+        </w:rPr>
+        <w:t xml:space="preserve"> </w:t>
+      </w:r>
+      <w:r>
+        <w:rPr>
+          <w:rStyle w:val="ConstantTok"/>
+        </w:rPr>
+        <w:t xml:space="preserve">TRUE</w:t>
+      </w:r>
+      <w:r>
+        <w:rPr>
+          <w:rStyle w:val="NormalTok"/>
+        </w:rPr>
+        <w:t xml:space="preserve">), </w:t>
+      </w:r>
+      <w:r>
+        <w:rPr>
+          <w:rStyle w:val="DecValTok"/>
+        </w:rPr>
+        <w:t xml:space="preserve">2</w:t>
+      </w:r>
+      <w:r>
+        <w:rPr>
+          <w:rStyle w:val="NormalTok"/>
+        </w:rPr>
+        <w:t xml:space="preserve">),</w:t>
+      </w:r>
+      <w:r>
+        <w:br/>
+      </w:r>
+      <w:r>
+        <w:rPr>
+          <w:rStyle w:val="NormalTok"/>
+        </w:rPr>
+        <w:t xml:space="preserve">    </w:t>
+      </w:r>
+      <w:r>
+        <w:rPr>
+          <w:rStyle w:val="AttributeTok"/>
+        </w:rPr>
+        <w:t xml:space="preserve">sd_length =</w:t>
+      </w:r>
+      <w:r>
+        <w:rPr>
+          <w:rStyle w:val="NormalTok"/>
+        </w:rPr>
+        <w:t xml:space="preserve"> </w:t>
+      </w:r>
+      <w:r>
+        <w:rPr>
+          <w:rStyle w:val="FunctionTok"/>
+        </w:rPr>
+        <w:t xml:space="preserve">sd</w:t>
+      </w:r>
+      <w:r>
+        <w:rPr>
+          <w:rStyle w:val="NormalTok"/>
+        </w:rPr>
+        <w:t xml:space="preserve">(length_mm, </w:t>
+      </w:r>
+      <w:r>
+        <w:rPr>
+          <w:rStyle w:val="AttributeTok"/>
+        </w:rPr>
+        <w:t xml:space="preserve">na.rm =</w:t>
+      </w:r>
+      <w:r>
+        <w:rPr>
+          <w:rStyle w:val="NormalTok"/>
+        </w:rPr>
+        <w:t xml:space="preserve"> </w:t>
+      </w:r>
+      <w:r>
+        <w:rPr>
+          <w:rStyle w:val="ConstantTok"/>
+        </w:rPr>
+        <w:t xml:space="preserve">TRUE</w:t>
+      </w:r>
+      <w:r>
+        <w:rPr>
+          <w:rStyle w:val="NormalTok"/>
+        </w:rPr>
+        <w:t xml:space="preserve">),</w:t>
+      </w:r>
+      <w:r>
+        <w:br/>
+      </w:r>
+      <w:r>
+        <w:rPr>
+          <w:rStyle w:val="NormalTok"/>
+        </w:rPr>
+        <w:t xml:space="preserve">    </w:t>
+      </w:r>
+      <w:r>
+        <w:rPr>
+          <w:rStyle w:val="AttributeTok"/>
+        </w:rPr>
+        <w:t xml:space="preserve">n =</w:t>
+      </w:r>
+      <w:r>
+        <w:rPr>
+          <w:rStyle w:val="NormalTok"/>
+        </w:rPr>
+        <w:t xml:space="preserve"> </w:t>
+      </w:r>
+      <w:r>
+        <w:rPr>
+          <w:rStyle w:val="FunctionTok"/>
+        </w:rPr>
+        <w:t xml:space="preserve">sum</w:t>
+      </w:r>
+      <w:r>
+        <w:rPr>
+          <w:rStyle w:val="NormalTok"/>
+        </w:rPr>
+        <w:t xml:space="preserve">(</w:t>
+      </w:r>
+      <w:r>
+        <w:rPr>
+          <w:rStyle w:val="SpecialCharTok"/>
+        </w:rPr>
+        <w:t xml:space="preserve">!</w:t>
+      </w:r>
+      <w:r>
+        <w:rPr>
+          <w:rStyle w:val="FunctionTok"/>
+        </w:rPr>
+        <w:t xml:space="preserve">is.na</w:t>
+      </w:r>
+      <w:r>
+        <w:rPr>
+          <w:rStyle w:val="NormalTok"/>
+        </w:rPr>
+        <w:t xml:space="preserve">(length_mm)),</w:t>
+      </w:r>
+      <w:r>
+        <w:br/>
+      </w:r>
+      <w:r>
+        <w:rPr>
+          <w:rStyle w:val="NormalTok"/>
+        </w:rPr>
+        <w:t xml:space="preserve">    </w:t>
+      </w:r>
+      <w:r>
+        <w:rPr>
+          <w:rStyle w:val="AttributeTok"/>
+        </w:rPr>
+        <w:t xml:space="preserve">se_length =</w:t>
+      </w:r>
+      <w:r>
+        <w:rPr>
+          <w:rStyle w:val="NormalTok"/>
+        </w:rPr>
+        <w:t xml:space="preserve"> </w:t>
+      </w:r>
+      <w:r>
+        <w:rPr>
+          <w:rStyle w:val="FunctionTok"/>
+        </w:rPr>
+        <w:t xml:space="preserve">round</w:t>
+      </w:r>
+      <w:r>
+        <w:rPr>
+          <w:rStyle w:val="NormalTok"/>
+        </w:rPr>
+        <w:t xml:space="preserve">(sd_length </w:t>
+      </w:r>
+      <w:r>
+        <w:rPr>
+          <w:rStyle w:val="SpecialCharTok"/>
+        </w:rPr>
+        <w:t xml:space="preserve">/</w:t>
+      </w:r>
+      <w:r>
+        <w:rPr>
+          <w:rStyle w:val="NormalTok"/>
+        </w:rPr>
+        <w:t xml:space="preserve"> </w:t>
+      </w:r>
+      <w:r>
+        <w:rPr>
+          <w:rStyle w:val="FunctionTok"/>
+        </w:rPr>
+        <w:t xml:space="preserve">sqrt</w:t>
+      </w:r>
+      <w:r>
+        <w:rPr>
+          <w:rStyle w:val="NormalTok"/>
+        </w:rPr>
+        <w:t xml:space="preserve">(</w:t>
+      </w:r>
+      <w:r>
+        <w:rPr>
+          <w:rStyle w:val="FunctionTok"/>
+        </w:rPr>
+        <w:t xml:space="preserve">sum</w:t>
+      </w:r>
+      <w:r>
+        <w:rPr>
+          <w:rStyle w:val="NormalTok"/>
+        </w:rPr>
+        <w:t xml:space="preserve">(</w:t>
+      </w:r>
+      <w:r>
+        <w:rPr>
+          <w:rStyle w:val="SpecialCharTok"/>
+        </w:rPr>
+        <w:t xml:space="preserve">!</w:t>
+      </w:r>
+      <w:r>
+        <w:rPr>
+          <w:rStyle w:val="FunctionTok"/>
+        </w:rPr>
+        <w:t xml:space="preserve">is.na</w:t>
+      </w:r>
+      <w:r>
+        <w:rPr>
+          <w:rStyle w:val="NormalTok"/>
+        </w:rPr>
+        <w:t xml:space="preserve">(length_mm))), </w:t>
+      </w:r>
+      <w:r>
+        <w:rPr>
+          <w:rStyle w:val="DecValTok"/>
+        </w:rPr>
+        <w:t xml:space="preserve">2</w:t>
+      </w:r>
+      <w:r>
+        <w:rPr>
+          <w:rStyle w:val="NormalTok"/>
+        </w:rPr>
+        <w:t xml:space="preserve">),</w:t>
+      </w:r>
+      <w:r>
+        <w:br/>
+      </w:r>
+      <w:r>
+        <w:rPr>
+          <w:rStyle w:val="NormalTok"/>
+        </w:rPr>
+        <w:t xml:space="preserve">    </w:t>
+      </w:r>
+      <w:r>
+        <w:rPr>
+          <w:rStyle w:val="AttributeTok"/>
+        </w:rPr>
+        <w:t xml:space="preserve">.groups =</w:t>
+      </w:r>
+      <w:r>
+        <w:rPr>
+          <w:rStyle w:val="NormalTok"/>
+        </w:rPr>
+        <w:t xml:space="preserve"> </w:t>
+      </w:r>
+      <w:r>
+        <w:rPr>
+          <w:rStyle w:val="StringTok"/>
+        </w:rPr>
+        <w:t xml:space="preserve">"drop"</w:t>
+      </w:r>
+      <w:r>
+        <w:br/>
+      </w:r>
+      <w:r>
+        <w:rPr>
+          <w:rStyle w:val="NormalTok"/>
+        </w:rPr>
+        <w:t xml:space="preserve">  )</w:t>
+      </w:r>
+      <w:r>
+        <w:br/>
+      </w:r>
+      <w:r>
+        <w:br/>
+      </w:r>
+      <w:r>
+        <w:rPr>
+          <w:rStyle w:val="CommentTok"/>
+        </w:rPr>
+        <w:t xml:space="preserve"># Display the results</w:t>
+      </w:r>
+      <w:r>
+        <w:br/>
+      </w:r>
+      <w:r>
+        <w:rPr>
+          <w:rStyle w:val="NormalTok"/>
+        </w:rPr>
+        <w:t xml:space="preserve">i3_stats</w:t>
+      </w:r>
+    </w:p>
+    <w:p>
+      <w:pPr>
+        <w:pStyle w:val="SourceCode"/>
+      </w:pPr>
+      <w:r>
+        <w:rPr>
+          <w:rStyle w:val="VerbatimChar"/>
+        </w:rPr>
+        <w:t xml:space="preserve"># A tibble: 1 × 4</w:t>
+      </w:r>
+      <w:r>
+        <w:br/>
+      </w:r>
+      <w:r>
+        <w:rPr>
+          <w:rStyle w:val="VerbatimChar"/>
+        </w:rPr>
+        <w:t xml:space="preserve">  mean_length sd_length     n se_length</w:t>
+      </w:r>
+      <w:r>
+        <w:br/>
+      </w:r>
+      <w:r>
+        <w:rPr>
+          <w:rStyle w:val="VerbatimChar"/>
+        </w:rPr>
+        <w:t xml:space="preserve">        &lt;dbl&gt;     &lt;dbl&gt; &lt;int&gt;     &lt;dbl&gt;</w:t>
+      </w:r>
+      <w:r>
+        <w:br/>
+      </w:r>
+      <w:r>
+        <w:rPr>
+          <w:rStyle w:val="VerbatimChar"/>
+        </w:rPr>
+        <w:t xml:space="preserve">1        266.      28.3    66      3.48</w:t>
+      </w:r>
+    </w:p>
+    <w:bookmarkEnd w:id="54"/>
+    <w:bookmarkStart w:id="59" w:name="lecture-4-z-score-example"/>
+    <w:p>
+      <w:pPr>
+        <w:pStyle w:val="Heading1"/>
+      </w:pPr>
+      <w:r>
+        <w:t xml:space="preserve">Lecture 4: Z-score Example</w:t>
+      </w:r>
+    </w:p>
+    <w:p>
+      <w:pPr>
+        <w:pStyle w:val="FirstParagraph"/>
+      </w:pPr>
+      <w:r>
+        <w:t xml:space="preserve">Done by converting original data points to z-scores</w:t>
+      </w:r>
+    </w:p>
+    <w:p>
+      <w:pPr>
+        <w:pStyle w:val="Compact"/>
+        <w:numPr>
+          <w:ilvl w:val="0"/>
+          <w:numId w:val="1013"/>
+        </w:numPr>
+      </w:pPr>
+      <w:r>
+        <w:t xml:space="preserve">Z-scores calculated as:</w:t>
+      </w:r>
+    </w:p>
+    <w:bookmarkStart w:id="55" w:name="textz-fracx_i-musigma-1"/>
     <w:p>
       <w:pPr>
         <w:pStyle w:val="Heading2"/>
@@ -2262,582 +2892,12 @@
         <w:pStyle w:val="Compact"/>
         <w:numPr>
           <w:ilvl w:val="0"/>
-          <w:numId w:val="1012"/>
+          <w:numId w:val="1014"/>
         </w:numPr>
       </w:pPr>
       <w:r>
         <w:t xml:space="preserve">z = z-score for observation</w:t>
       </w:r>
-    </w:p>
-    <w:p>
-      <w:pPr>
-        <w:pStyle w:val="Compact"/>
-        <w:numPr>
-          <w:ilvl w:val="0"/>
-          <w:numId w:val="1012"/>
-        </w:numPr>
-      </w:pPr>
-      <w:r>
-        <w:t xml:space="preserve">xi = original observation</w:t>
-      </w:r>
-    </w:p>
-    <w:p>
-      <w:pPr>
-        <w:pStyle w:val="Compact"/>
-        <w:numPr>
-          <w:ilvl w:val="0"/>
-          <w:numId w:val="1012"/>
-        </w:numPr>
-      </w:pPr>
-      <w:r>
-        <w:t xml:space="preserve">µ = mean of data distribution</w:t>
-      </w:r>
-    </w:p>
-    <w:p>
-      <w:pPr>
-        <w:pStyle w:val="Compact"/>
-        <w:numPr>
-          <w:ilvl w:val="0"/>
-          <w:numId w:val="1012"/>
-        </w:numPr>
-      </w:pPr>
-      <w:r>
-        <w:t xml:space="preserve">σ = SD of data distribution</w:t>
-      </w:r>
-    </w:p>
-    <w:p>
-      <w:pPr>
-        <w:pStyle w:val="FirstParagraph"/>
-      </w:pPr>
-      <w:r>
-        <w:t xml:space="preserve">So lets do this for a fish that is 300mm long and guess the probability</w:t>
-      </w:r>
-      <w:r>
-        <w:t xml:space="preserve"> </w:t>
-      </w:r>
-      <w:r>
-        <w:t xml:space="preserve">of catching something larger</w:t>
-      </w:r>
-    </w:p>
-    <w:p>
-      <w:pPr>
-        <w:pStyle w:val="BodyText"/>
-      </w:pPr>
-      <w:r>
-        <w:t xml:space="preserve">z = (300 - 265.61)/28.3 = 1.215194</w:t>
-      </w:r>
-    </w:p>
-    <w:bookmarkEnd w:id="53"/>
-    <w:p>
-      <w:pPr>
-        <w:pStyle w:val="SourceCode"/>
-      </w:pPr>
-      <w:r>
-        <w:rPr>
-          <w:rStyle w:val="NormalTok"/>
-        </w:rPr>
-        <w:t xml:space="preserve">i3_stats </w:t>
-      </w:r>
-      <w:r>
-        <w:rPr>
-          <w:rStyle w:val="OtherTok"/>
-        </w:rPr>
-        <w:t xml:space="preserve">&lt;-</w:t>
-      </w:r>
-      <w:r>
-        <w:rPr>
-          <w:rStyle w:val="NormalTok"/>
-        </w:rPr>
-        <w:t xml:space="preserve"> gray_i3_df </w:t>
-      </w:r>
-      <w:r>
-        <w:rPr>
-          <w:rStyle w:val="SpecialCharTok"/>
-        </w:rPr>
-        <w:t xml:space="preserve">%&gt;%</w:t>
-      </w:r>
-      <w:r>
-        <w:br/>
-      </w:r>
-      <w:r>
-        <w:rPr>
-          <w:rStyle w:val="NormalTok"/>
-        </w:rPr>
-        <w:t xml:space="preserve">  </w:t>
-      </w:r>
-      <w:r>
-        <w:rPr>
-          <w:rStyle w:val="FunctionTok"/>
-        </w:rPr>
-        <w:t xml:space="preserve">summarize</w:t>
-      </w:r>
-      <w:r>
-        <w:rPr>
-          <w:rStyle w:val="NormalTok"/>
-        </w:rPr>
-        <w:t xml:space="preserve">(</w:t>
-      </w:r>
-      <w:r>
-        <w:br/>
-      </w:r>
-      <w:r>
-        <w:rPr>
-          <w:rStyle w:val="NormalTok"/>
-        </w:rPr>
-        <w:t xml:space="preserve">    </w:t>
-      </w:r>
-      <w:r>
-        <w:rPr>
-          <w:rStyle w:val="AttributeTok"/>
-        </w:rPr>
-        <w:t xml:space="preserve">mean_length =</w:t>
-      </w:r>
-      <w:r>
-        <w:rPr>
-          <w:rStyle w:val="NormalTok"/>
-        </w:rPr>
-        <w:t xml:space="preserve"> </w:t>
-      </w:r>
-      <w:r>
-        <w:rPr>
-          <w:rStyle w:val="FunctionTok"/>
-        </w:rPr>
-        <w:t xml:space="preserve">round</w:t>
-      </w:r>
-      <w:r>
-        <w:rPr>
-          <w:rStyle w:val="NormalTok"/>
-        </w:rPr>
-        <w:t xml:space="preserve">(</w:t>
-      </w:r>
-      <w:r>
-        <w:rPr>
-          <w:rStyle w:val="FunctionTok"/>
-        </w:rPr>
-        <w:t xml:space="preserve">mean</w:t>
-      </w:r>
-      <w:r>
-        <w:rPr>
-          <w:rStyle w:val="NormalTok"/>
-        </w:rPr>
-        <w:t xml:space="preserve">(length_mm, </w:t>
-      </w:r>
-      <w:r>
-        <w:rPr>
-          <w:rStyle w:val="AttributeTok"/>
-        </w:rPr>
-        <w:t xml:space="preserve">na.rm =</w:t>
-      </w:r>
-      <w:r>
-        <w:rPr>
-          <w:rStyle w:val="NormalTok"/>
-        </w:rPr>
-        <w:t xml:space="preserve"> </w:t>
-      </w:r>
-      <w:r>
-        <w:rPr>
-          <w:rStyle w:val="ConstantTok"/>
-        </w:rPr>
-        <w:t xml:space="preserve">TRUE</w:t>
-      </w:r>
-      <w:r>
-        <w:rPr>
-          <w:rStyle w:val="NormalTok"/>
-        </w:rPr>
-        <w:t xml:space="preserve">), </w:t>
-      </w:r>
-      <w:r>
-        <w:rPr>
-          <w:rStyle w:val="DecValTok"/>
-        </w:rPr>
-        <w:t xml:space="preserve">2</w:t>
-      </w:r>
-      <w:r>
-        <w:rPr>
-          <w:rStyle w:val="NormalTok"/>
-        </w:rPr>
-        <w:t xml:space="preserve">),</w:t>
-      </w:r>
-      <w:r>
-        <w:br/>
-      </w:r>
-      <w:r>
-        <w:rPr>
-          <w:rStyle w:val="NormalTok"/>
-        </w:rPr>
-        <w:t xml:space="preserve">    </w:t>
-      </w:r>
-      <w:r>
-        <w:rPr>
-          <w:rStyle w:val="AttributeTok"/>
-        </w:rPr>
-        <w:t xml:space="preserve">sd_length =</w:t>
-      </w:r>
-      <w:r>
-        <w:rPr>
-          <w:rStyle w:val="NormalTok"/>
-        </w:rPr>
-        <w:t xml:space="preserve"> </w:t>
-      </w:r>
-      <w:r>
-        <w:rPr>
-          <w:rStyle w:val="FunctionTok"/>
-        </w:rPr>
-        <w:t xml:space="preserve">sd</w:t>
-      </w:r>
-      <w:r>
-        <w:rPr>
-          <w:rStyle w:val="NormalTok"/>
-        </w:rPr>
-        <w:t xml:space="preserve">(length_mm, </w:t>
-      </w:r>
-      <w:r>
-        <w:rPr>
-          <w:rStyle w:val="AttributeTok"/>
-        </w:rPr>
-        <w:t xml:space="preserve">na.rm =</w:t>
-      </w:r>
-      <w:r>
-        <w:rPr>
-          <w:rStyle w:val="NormalTok"/>
-        </w:rPr>
-        <w:t xml:space="preserve"> </w:t>
-      </w:r>
-      <w:r>
-        <w:rPr>
-          <w:rStyle w:val="ConstantTok"/>
-        </w:rPr>
-        <w:t xml:space="preserve">TRUE</w:t>
-      </w:r>
-      <w:r>
-        <w:rPr>
-          <w:rStyle w:val="NormalTok"/>
-        </w:rPr>
-        <w:t xml:space="preserve">),</w:t>
-      </w:r>
-      <w:r>
-        <w:br/>
-      </w:r>
-      <w:r>
-        <w:rPr>
-          <w:rStyle w:val="NormalTok"/>
-        </w:rPr>
-        <w:t xml:space="preserve">    </w:t>
-      </w:r>
-      <w:r>
-        <w:rPr>
-          <w:rStyle w:val="AttributeTok"/>
-        </w:rPr>
-        <w:t xml:space="preserve">n =</w:t>
-      </w:r>
-      <w:r>
-        <w:rPr>
-          <w:rStyle w:val="NormalTok"/>
-        </w:rPr>
-        <w:t xml:space="preserve"> </w:t>
-      </w:r>
-      <w:r>
-        <w:rPr>
-          <w:rStyle w:val="FunctionTok"/>
-        </w:rPr>
-        <w:t xml:space="preserve">sum</w:t>
-      </w:r>
-      <w:r>
-        <w:rPr>
-          <w:rStyle w:val="NormalTok"/>
-        </w:rPr>
-        <w:t xml:space="preserve">(</w:t>
-      </w:r>
-      <w:r>
-        <w:rPr>
-          <w:rStyle w:val="SpecialCharTok"/>
-        </w:rPr>
-        <w:t xml:space="preserve">!</w:t>
-      </w:r>
-      <w:r>
-        <w:rPr>
-          <w:rStyle w:val="FunctionTok"/>
-        </w:rPr>
-        <w:t xml:space="preserve">is.na</w:t>
-      </w:r>
-      <w:r>
-        <w:rPr>
-          <w:rStyle w:val="NormalTok"/>
-        </w:rPr>
-        <w:t xml:space="preserve">(length_mm)),</w:t>
-      </w:r>
-      <w:r>
-        <w:br/>
-      </w:r>
-      <w:r>
-        <w:rPr>
-          <w:rStyle w:val="NormalTok"/>
-        </w:rPr>
-        <w:t xml:space="preserve">    </w:t>
-      </w:r>
-      <w:r>
-        <w:rPr>
-          <w:rStyle w:val="AttributeTok"/>
-        </w:rPr>
-        <w:t xml:space="preserve">se_length =</w:t>
-      </w:r>
-      <w:r>
-        <w:rPr>
-          <w:rStyle w:val="NormalTok"/>
-        </w:rPr>
-        <w:t xml:space="preserve"> </w:t>
-      </w:r>
-      <w:r>
-        <w:rPr>
-          <w:rStyle w:val="FunctionTok"/>
-        </w:rPr>
-        <w:t xml:space="preserve">round</w:t>
-      </w:r>
-      <w:r>
-        <w:rPr>
-          <w:rStyle w:val="NormalTok"/>
-        </w:rPr>
-        <w:t xml:space="preserve">(sd_length </w:t>
-      </w:r>
-      <w:r>
-        <w:rPr>
-          <w:rStyle w:val="SpecialCharTok"/>
-        </w:rPr>
-        <w:t xml:space="preserve">/</w:t>
-      </w:r>
-      <w:r>
-        <w:rPr>
-          <w:rStyle w:val="NormalTok"/>
-        </w:rPr>
-        <w:t xml:space="preserve"> </w:t>
-      </w:r>
-      <w:r>
-        <w:rPr>
-          <w:rStyle w:val="FunctionTok"/>
-        </w:rPr>
-        <w:t xml:space="preserve">sqrt</w:t>
-      </w:r>
-      <w:r>
-        <w:rPr>
-          <w:rStyle w:val="NormalTok"/>
-        </w:rPr>
-        <w:t xml:space="preserve">(</w:t>
-      </w:r>
-      <w:r>
-        <w:rPr>
-          <w:rStyle w:val="FunctionTok"/>
-        </w:rPr>
-        <w:t xml:space="preserve">sum</w:t>
-      </w:r>
-      <w:r>
-        <w:rPr>
-          <w:rStyle w:val="NormalTok"/>
-        </w:rPr>
-        <w:t xml:space="preserve">(</w:t>
-      </w:r>
-      <w:r>
-        <w:rPr>
-          <w:rStyle w:val="SpecialCharTok"/>
-        </w:rPr>
-        <w:t xml:space="preserve">!</w:t>
-      </w:r>
-      <w:r>
-        <w:rPr>
-          <w:rStyle w:val="FunctionTok"/>
-        </w:rPr>
-        <w:t xml:space="preserve">is.na</w:t>
-      </w:r>
-      <w:r>
-        <w:rPr>
-          <w:rStyle w:val="NormalTok"/>
-        </w:rPr>
-        <w:t xml:space="preserve">(length_mm))), </w:t>
-      </w:r>
-      <w:r>
-        <w:rPr>
-          <w:rStyle w:val="DecValTok"/>
-        </w:rPr>
-        <w:t xml:space="preserve">2</w:t>
-      </w:r>
-      <w:r>
-        <w:rPr>
-          <w:rStyle w:val="NormalTok"/>
-        </w:rPr>
-        <w:t xml:space="preserve">),</w:t>
-      </w:r>
-      <w:r>
-        <w:br/>
-      </w:r>
-      <w:r>
-        <w:rPr>
-          <w:rStyle w:val="NormalTok"/>
-        </w:rPr>
-        <w:t xml:space="preserve">    </w:t>
-      </w:r>
-      <w:r>
-        <w:rPr>
-          <w:rStyle w:val="AttributeTok"/>
-        </w:rPr>
-        <w:t xml:space="preserve">.groups =</w:t>
-      </w:r>
-      <w:r>
-        <w:rPr>
-          <w:rStyle w:val="NormalTok"/>
-        </w:rPr>
-        <w:t xml:space="preserve"> </w:t>
-      </w:r>
-      <w:r>
-        <w:rPr>
-          <w:rStyle w:val="StringTok"/>
-        </w:rPr>
-        <w:t xml:space="preserve">"drop"</w:t>
-      </w:r>
-      <w:r>
-        <w:br/>
-      </w:r>
-      <w:r>
-        <w:rPr>
-          <w:rStyle w:val="NormalTok"/>
-        </w:rPr>
-        <w:t xml:space="preserve">  )</w:t>
-      </w:r>
-      <w:r>
-        <w:br/>
-      </w:r>
-      <w:r>
-        <w:br/>
-      </w:r>
-      <w:r>
-        <w:rPr>
-          <w:rStyle w:val="CommentTok"/>
-        </w:rPr>
-        <w:t xml:space="preserve"># Display the results</w:t>
-      </w:r>
-      <w:r>
-        <w:br/>
-      </w:r>
-      <w:r>
-        <w:rPr>
-          <w:rStyle w:val="NormalTok"/>
-        </w:rPr>
-        <w:t xml:space="preserve">i3_stats</w:t>
-      </w:r>
-    </w:p>
-    <w:p>
-      <w:pPr>
-        <w:pStyle w:val="SourceCode"/>
-      </w:pPr>
-      <w:r>
-        <w:rPr>
-          <w:rStyle w:val="VerbatimChar"/>
-        </w:rPr>
-        <w:t xml:space="preserve"># A tibble: 1 × 4</w:t>
-      </w:r>
-      <w:r>
-        <w:br/>
-      </w:r>
-      <w:r>
-        <w:rPr>
-          <w:rStyle w:val="VerbatimChar"/>
-        </w:rPr>
-        <w:t xml:space="preserve">  mean_length sd_length     n se_length</w:t>
-      </w:r>
-      <w:r>
-        <w:br/>
-      </w:r>
-      <w:r>
-        <w:rPr>
-          <w:rStyle w:val="VerbatimChar"/>
-        </w:rPr>
-        <w:t xml:space="preserve">        &lt;dbl&gt;     &lt;dbl&gt; &lt;int&gt;     &lt;dbl&gt;</w:t>
-      </w:r>
-      <w:r>
-        <w:br/>
-      </w:r>
-      <w:r>
-        <w:rPr>
-          <w:rStyle w:val="VerbatimChar"/>
-        </w:rPr>
-        <w:t xml:space="preserve">1        266.      28.3    66      3.48</w:t>
-      </w:r>
-    </w:p>
-    <w:bookmarkEnd w:id="54"/>
-    <w:bookmarkStart w:id="59" w:name="lecture-4-z-score-example"/>
-    <w:p>
-      <w:pPr>
-        <w:pStyle w:val="Heading1"/>
-      </w:pPr>
-      <w:r>
-        <w:t xml:space="preserve">Lecture 4: Z-score Example</w:t>
-      </w:r>
-    </w:p>
-    <w:p>
-      <w:pPr>
-        <w:pStyle w:val="FirstParagraph"/>
-      </w:pPr>
-      <w:r>
-        <w:t xml:space="preserve">Done by converting original data points to z-scores</w:t>
-      </w:r>
-    </w:p>
-    <w:p>
-      <w:pPr>
-        <w:pStyle w:val="Compact"/>
-        <w:numPr>
-          <w:ilvl w:val="0"/>
-          <w:numId w:val="1013"/>
-        </w:numPr>
-      </w:pPr>
-      <w:r>
-        <w:t xml:space="preserve">Z-scores calculated as:</w:t>
-      </w:r>
-    </w:p>
-    <w:bookmarkStart w:id="55" w:name="textz-fracx_i-musigma-1"/>
-    <w:p>
-      <w:pPr>
-        <w:pStyle w:val="Heading2"/>
-      </w:pPr>
-      <m:oMath>
-        <m:r>
-          <m:rPr>
-            <m:nor/>
-            <m:sty m:val="p"/>
-          </m:rPr>
-          <m:t>Z = </m:t>
-        </m:r>
-        <m:f>
-          <m:fPr>
-            <m:type m:val="bar"/>
-          </m:fPr>
-          <m:num>
-            <m:sSub>
-              <m:e>
-                <m:r>
-                  <m:t>X</m:t>
-                </m:r>
-              </m:e>
-              <m:sub>
-                <m:r>
-                  <m:t>i</m:t>
-                </m:r>
-              </m:sub>
-            </m:sSub>
-            <m:r>
-              <m:rPr>
-                <m:sty m:val="p"/>
-              </m:rPr>
-              <m:t>−</m:t>
-            </m:r>
-            <m:r>
-              <m:t>μ</m:t>
-            </m:r>
-          </m:num>
-          <m:den>
-            <m:r>
-              <m:t>σ</m:t>
-            </m:r>
-          </m:den>
-        </m:f>
-      </m:oMath>
     </w:p>
     <w:p>
       <w:pPr>
@@ -2848,7 +2908,7 @@
         </w:numPr>
       </w:pPr>
       <w:r>
-        <w:t xml:space="preserve">z = z-score for observation</w:t>
+        <w:t xml:space="preserve">xi = original observation</w:t>
       </w:r>
     </w:p>
     <w:p>
@@ -2860,7 +2920,7 @@
         </w:numPr>
       </w:pPr>
       <w:r>
-        <w:t xml:space="preserve">xi = original observation</w:t>
+        <w:t xml:space="preserve">µ = mean of data distribution</w:t>
       </w:r>
     </w:p>
     <w:p>
@@ -2872,18 +2932,6 @@
         </w:numPr>
       </w:pPr>
       <w:r>
-        <w:t xml:space="preserve">µ = mean of data distribution</w:t>
-      </w:r>
-    </w:p>
-    <w:p>
-      <w:pPr>
-        <w:pStyle w:val="Compact"/>
-        <w:numPr>
-          <w:ilvl w:val="0"/>
-          <w:numId w:val="1014"/>
-        </w:numPr>
-      </w:pPr>
-      <w:r>
         <w:t xml:space="preserve">σ = SD of data distribution</w:t>
       </w:r>
     </w:p>
@@ -2892,7 +2940,7 @@
         <w:pStyle w:val="FirstParagraph"/>
       </w:pPr>
       <w:r>
-        <w:t xml:space="preserve">So lets do this for a fish that is 320mm long and guess the probability</w:t>
+        <w:t xml:space="preserve">So lets do this for a fish that is 300mm long and guess the probability</w:t>
       </w:r>
       <w:r>
         <w:t xml:space="preserve"> </w:t>
@@ -2906,7 +2954,7 @@
         <w:pStyle w:val="BodyText"/>
       </w:pPr>
       <w:r>
-        <w:t xml:space="preserve">z = (320 - 265.61)/28.3 = 1.92</w:t>
+        <w:t xml:space="preserve">z = (300 - 265.61)/28.3 = 1.22</w:t>
       </w:r>
     </w:p>
     <w:p>
@@ -2914,7 +2962,7 @@
         <w:pStyle w:val="BodyText"/>
       </w:pPr>
       <w:r>
-        <w:t xml:space="preserve">or .9726 in table or 97.3% is the area left of the curve and</w:t>
+        <w:t xml:space="preserve">or 0.8888 in table or 88.9% is the area left of the curve and</w:t>
       </w:r>
     </w:p>
     <w:p>
@@ -2922,7 +2970,23 @@
         <w:pStyle w:val="BodyText"/>
       </w:pPr>
       <w:r>
-        <w:t xml:space="preserve">100 - 97.3 = 2.7% or 2.7% of fish are expected to be longer</w:t>
+        <w:t xml:space="preserve">100 - 88.9 = 11.27% or 11.2% of fish are expected to be longer</w:t>
+      </w:r>
+    </w:p>
+    <w:p>
+      <w:pPr>
+        <w:pStyle w:val="BodyText"/>
+      </w:pPr>
+      <w:r>
+        <w:t xml:space="preserve">So do you think you can catch something larger than 300 mm?</w:t>
+      </w:r>
+    </w:p>
+    <w:p>
+      <w:pPr>
+        <w:pStyle w:val="BodyText"/>
+      </w:pPr>
+      <w:r>
+        <w:t xml:space="preserve">At what point do you think its not likely?</w:t>
       </w:r>
     </w:p>
     <w:bookmarkEnd w:id="55"/>
@@ -2933,7 +2997,7 @@
       <w:r>
         <w:drawing>
           <wp:inline>
-            <wp:extent cx="2857500" cy="2381250"/>
+            <wp:extent cx="4219575" cy="3848100"/>
             <wp:effectExtent b="0" l="0" r="0" t="0"/>
             <wp:docPr descr="" title="" id="57" name="Picture"/>
             <a:graphic>
@@ -2954,7 +3018,7 @@
                   <pic:spPr bwMode="auto">
                     <a:xfrm>
                       <a:off x="0" y="0"/>
-                      <a:ext cx="2857500" cy="2381250"/>
+                      <a:ext cx="4219575" cy="3848100"/>
                     </a:xfrm>
                     <a:prstGeom prst="rect">
                       <a:avLst/>
@@ -3175,6 +3239,10 @@
         </w:numPr>
       </w:pPr>
       <w:r>
+        <w:rPr>
+          <w:b/>
+          <w:bCs/>
+        </w:rPr>
         <w:t xml:space="preserve">SEM is used to construct confidence intervals</w:t>
       </w:r>
     </w:p>
@@ -3187,6 +3255,10 @@
         </w:numPr>
       </w:pPr>
       <w:r>
+        <w:rPr>
+          <w:b/>
+          <w:bCs/>
+        </w:rPr>
         <w:t xml:space="preserve">SEM measures the precision of the sample mean</w:t>
       </w:r>
     </w:p>
@@ -3464,7 +3536,7 @@
               <w:rPr>
                 <w:rStyle w:val="DecValTok"/>
               </w:rPr>
-              <w:t xml:space="preserve">5</w:t>
+              <w:t xml:space="preserve">3</w:t>
             </w:r>
             <w:r>
               <w:rPr>
@@ -3578,7 +3650,7 @@
               <w:rPr>
                 <w:rStyle w:val="DecValTok"/>
               </w:rPr>
-              <w:t xml:space="preserve">125</w:t>
+              <w:t xml:space="preserve">60</w:t>
             </w:r>
             <w:r>
               <w:rPr>
@@ -3623,6 +3695,18 @@
               <w:rPr>
                 <w:rStyle w:val="FunctionTok"/>
               </w:rPr>
+              <w:t xml:space="preserve">round</w:t>
+            </w:r>
+            <w:r>
+              <w:rPr>
+                <w:rStyle w:val="NormalTok"/>
+              </w:rPr>
+              <w:t xml:space="preserve">(</w:t>
+            </w:r>
+            <w:r>
+              <w:rPr>
+                <w:rStyle w:val="FunctionTok"/>
+              </w:rPr>
               <w:t xml:space="preserve">mean</w:t>
             </w:r>
             <w:r>
@@ -3665,6 +3749,18 @@
               <w:rPr>
                 <w:rStyle w:val="NormalTok"/>
               </w:rPr>
+              <w:t xml:space="preserve">),</w:t>
+            </w:r>
+            <w:r>
+              <w:rPr>
+                <w:rStyle w:val="DecValTok"/>
+              </w:rPr>
+              <w:t xml:space="preserve">2</w:t>
+            </w:r>
+            <w:r>
+              <w:rPr>
+                <w:rStyle w:val="NormalTok"/>
+              </w:rPr>
               <w:t xml:space="preserve">)</w:t>
             </w:r>
             <w:r>
@@ -3692,6 +3788,18 @@
               <w:rPr>
                 <w:rStyle w:val="FunctionTok"/>
               </w:rPr>
+              <w:t xml:space="preserve">round</w:t>
+            </w:r>
+            <w:r>
+              <w:rPr>
+                <w:rStyle w:val="NormalTok"/>
+              </w:rPr>
+              <w:t xml:space="preserve">(</w:t>
+            </w:r>
+            <w:r>
+              <w:rPr>
+                <w:rStyle w:val="FunctionTok"/>
+              </w:rPr>
               <w:t xml:space="preserve">sd</w:t>
             </w:r>
             <w:r>
@@ -3764,7 +3872,19 @@
               <w:rPr>
                 <w:rStyle w:val="DecValTok"/>
               </w:rPr>
-              <w:t xml:space="preserve">10</w:t>
+              <w:t xml:space="preserve">30</w:t>
+            </w:r>
+            <w:r>
+              <w:rPr>
+                <w:rStyle w:val="NormalTok"/>
+              </w:rPr>
+              <w:t xml:space="preserve">),</w:t>
+            </w:r>
+            <w:r>
+              <w:rPr>
+                <w:rStyle w:val="DecValTok"/>
+              </w:rPr>
+              <w:t xml:space="preserve">4</w:t>
             </w:r>
             <w:r>
               <w:rPr>
@@ -3800,6 +3920,18 @@
               <w:rPr>
                 <w:rStyle w:val="FunctionTok"/>
               </w:rPr>
+              <w:t xml:space="preserve">round</w:t>
+            </w:r>
+            <w:r>
+              <w:rPr>
+                <w:rStyle w:val="NormalTok"/>
+              </w:rPr>
+              <w:t xml:space="preserve">(</w:t>
+            </w:r>
+            <w:r>
+              <w:rPr>
+                <w:rStyle w:val="FunctionTok"/>
+              </w:rPr>
               <w:t xml:space="preserve">mean</w:t>
             </w:r>
             <w:r>
@@ -3842,6 +3974,18 @@
               <w:rPr>
                 <w:rStyle w:val="NormalTok"/>
               </w:rPr>
+              <w:t xml:space="preserve">),</w:t>
+            </w:r>
+            <w:r>
+              <w:rPr>
+                <w:rStyle w:val="DecValTok"/>
+              </w:rPr>
+              <w:t xml:space="preserve">2</w:t>
+            </w:r>
+            <w:r>
+              <w:rPr>
+                <w:rStyle w:val="NormalTok"/>
+              </w:rPr>
               <w:t xml:space="preserve">)</w:t>
             </w:r>
             <w:r>
@@ -3869,6 +4013,18 @@
               <w:rPr>
                 <w:rStyle w:val="FunctionTok"/>
               </w:rPr>
+              <w:t xml:space="preserve">round</w:t>
+            </w:r>
+            <w:r>
+              <w:rPr>
+                <w:rStyle w:val="NormalTok"/>
+              </w:rPr>
+              <w:t xml:space="preserve">(</w:t>
+            </w:r>
+            <w:r>
+              <w:rPr>
+                <w:rStyle w:val="FunctionTok"/>
+              </w:rPr>
               <w:t xml:space="preserve">sd</w:t>
             </w:r>
             <w:r>
@@ -3947,6 +4103,18 @@
               <w:rPr>
                 <w:rStyle w:val="NormalTok"/>
               </w:rPr>
+              <w:t xml:space="preserve">),</w:t>
+            </w:r>
+            <w:r>
+              <w:rPr>
+                <w:rStyle w:val="DecValTok"/>
+              </w:rPr>
+              <w:t xml:space="preserve">4</w:t>
+            </w:r>
+            <w:r>
+              <w:rPr>
+                <w:rStyle w:val="NormalTok"/>
+              </w:rPr>
               <w:t xml:space="preserve">)</w:t>
             </w:r>
             <w:r>
@@ -3977,6 +4145,18 @@
               <w:rPr>
                 <w:rStyle w:val="FunctionTok"/>
               </w:rPr>
+              <w:t xml:space="preserve">round</w:t>
+            </w:r>
+            <w:r>
+              <w:rPr>
+                <w:rStyle w:val="NormalTok"/>
+              </w:rPr>
+              <w:t xml:space="preserve">(</w:t>
+            </w:r>
+            <w:r>
+              <w:rPr>
+                <w:rStyle w:val="FunctionTok"/>
+              </w:rPr>
               <w:t xml:space="preserve">mean</w:t>
             </w:r>
             <w:r>
@@ -4019,6 +4199,18 @@
               <w:rPr>
                 <w:rStyle w:val="NormalTok"/>
               </w:rPr>
+              <w:t xml:space="preserve">),</w:t>
+            </w:r>
+            <w:r>
+              <w:rPr>
+                <w:rStyle w:val="DecValTok"/>
+              </w:rPr>
+              <w:t xml:space="preserve">2</w:t>
+            </w:r>
+            <w:r>
+              <w:rPr>
+                <w:rStyle w:val="NormalTok"/>
+              </w:rPr>
               <w:t xml:space="preserve">)</w:t>
             </w:r>
             <w:r>
@@ -4046,6 +4238,18 @@
               <w:rPr>
                 <w:rStyle w:val="FunctionTok"/>
               </w:rPr>
+              <w:t xml:space="preserve">round</w:t>
+            </w:r>
+            <w:r>
+              <w:rPr>
+                <w:rStyle w:val="NormalTok"/>
+              </w:rPr>
+              <w:t xml:space="preserve">(</w:t>
+            </w:r>
+            <w:r>
+              <w:rPr>
+                <w:rStyle w:val="FunctionTok"/>
+              </w:rPr>
               <w:t xml:space="preserve">sd</w:t>
             </w:r>
             <w:r>
@@ -4118,7 +4322,19 @@
               <w:rPr>
                 <w:rStyle w:val="DecValTok"/>
               </w:rPr>
-              <w:t xml:space="preserve">100</w:t>
+              <w:t xml:space="preserve">60</w:t>
+            </w:r>
+            <w:r>
+              <w:rPr>
+                <w:rStyle w:val="NormalTok"/>
+              </w:rPr>
+              <w:t xml:space="preserve">),</w:t>
+            </w:r>
+            <w:r>
+              <w:rPr>
+                <w:rStyle w:val="DecValTok"/>
+              </w:rPr>
+              <w:t xml:space="preserve">4</w:t>
             </w:r>
             <w:r>
               <w:rPr>
@@ -4208,7 +4424,7 @@
               <w:rPr>
                 <w:rStyle w:val="DecValTok"/>
               </w:rPr>
-              <w:t xml:space="preserve">10</w:t>
+              <w:t xml:space="preserve">3</w:t>
             </w:r>
             <w:r>
               <w:rPr>
@@ -4232,7 +4448,7 @@
               <w:rPr>
                 <w:rStyle w:val="DecValTok"/>
               </w:rPr>
-              <w:t xml:space="preserve">100</w:t>
+              <w:t xml:space="preserve">60</w:t>
             </w:r>
             <w:r>
               <w:rPr>
@@ -4345,7 +4561,7 @@
               <w:rPr>
                 <w:rStyle w:val="VerbatimChar"/>
               </w:rPr>
-              <w:t xml:space="preserve">  Sample_Size    Mean        SE</w:t>
+              <w:t xml:space="preserve">  Sample_Size   Mean      SE</w:t>
             </w:r>
             <w:r>
               <w:br/>
@@ -4354,7 +4570,7 @@
               <w:rPr>
                 <w:rStyle w:val="VerbatimChar"/>
               </w:rPr>
-              <w:t xml:space="preserve">1          10 302.000 26.607330</w:t>
+              <w:t xml:space="preserve">1           3 278.33 16.6096</w:t>
             </w:r>
             <w:r>
               <w:br/>
@@ -4363,7 +4579,7 @@
               <w:rPr>
                 <w:rStyle w:val="VerbatimChar"/>
               </w:rPr>
-              <w:t xml:space="preserve">2          30 319.200 12.082989</w:t>
+              <w:t xml:space="preserve">2          30 321.07 12.0926</w:t>
             </w:r>
             <w:r>
               <w:br/>
@@ -4372,7 +4588,7 @@
               <w:rPr>
                 <w:rStyle w:val="VerbatimChar"/>
               </w:rPr>
-              <w:t xml:space="preserve">3         100 323.328  6.478149</w:t>
+              <w:t xml:space="preserve">3          60 311.78  8.3944</w:t>
             </w:r>
           </w:p>
           <w:p>
@@ -4809,13 +5025,31 @@
         <w:t xml:space="preserve"> </w:t>
       </w:r>
       <w:r>
-        <w:t xml:space="preserve">depends on - sample s (standard deviation) -</w:t>
-      </w:r>
-      <w:r>
-        <w:t xml:space="preserve"> </w:t>
-      </w:r>
-      <w:r>
-        <w:t xml:space="preserve">sample n - (</w:t>
+        <w:t xml:space="preserve">depends on</w:t>
+      </w:r>
+    </w:p>
+    <w:p>
+      <w:pPr>
+        <w:pStyle w:val="Compact"/>
+        <w:numPr>
+          <w:ilvl w:val="0"/>
+          <w:numId w:val="1020"/>
+        </w:numPr>
+      </w:pPr>
+      <w:r>
+        <w:t xml:space="preserve">- sample s (standard deviation)</w:t>
+      </w:r>
+    </w:p>
+    <w:p>
+      <w:pPr>
+        <w:pStyle w:val="Compact"/>
+        <w:numPr>
+          <w:ilvl w:val="0"/>
+          <w:numId w:val="1020"/>
+        </w:numPr>
+      </w:pPr>
+      <w:r>
+        <w:t xml:space="preserve">- sample n - (</w:t>
       </w:r>
       <m:oMath>
         <m:sSub>
@@ -4873,16 +5107,10 @@
     </w:p>
     <w:p>
       <w:pPr>
-        <w:pStyle w:val="BodyText"/>
-      </w:pPr>
-      <w:r>
-        <w:t xml:space="preserve">How and why? - Decreases with sample n - number - increases with sample</w:t>
-      </w:r>
-      <w:r>
-        <w:t xml:space="preserve"> </w:t>
-      </w:r>
-      <w:r>
-        <w:t xml:space="preserve">s - standard deviation</w:t>
+        <w:pStyle w:val="FirstParagraph"/>
+      </w:pPr>
+      <w:r>
+        <w:t xml:space="preserve">How and why?</w:t>
       </w:r>
     </w:p>
     <w:p>
@@ -4890,7 +5118,25 @@
         <w:pStyle w:val="Compact"/>
         <w:numPr>
           <w:ilvl w:val="0"/>
-          <w:numId w:val="1020"/>
+          <w:numId w:val="1021"/>
+        </w:numPr>
+      </w:pPr>
+      <w:r>
+        <w:t xml:space="preserve">Decreases with sample n - number - increases with sample s -</w:t>
+      </w:r>
+      <w:r>
+        <w:t xml:space="preserve"> </w:t>
+      </w:r>
+      <w:r>
+        <w:t xml:space="preserve">standard deviation</w:t>
+      </w:r>
+    </w:p>
+    <w:p>
+      <w:pPr>
+        <w:pStyle w:val="Compact"/>
+        <w:numPr>
+          <w:ilvl w:val="0"/>
+          <w:numId w:val="1021"/>
         </w:numPr>
       </w:pPr>
       <w:r>
@@ -5086,7 +5332,7 @@
         <w:pStyle w:val="Compact"/>
         <w:numPr>
           <w:ilvl w:val="0"/>
-          <w:numId w:val="1021"/>
+          <w:numId w:val="1022"/>
         </w:numPr>
       </w:pPr>
       <m:oMath>
@@ -5106,7 +5352,7 @@
         <w:pStyle w:val="Compact"/>
         <w:numPr>
           <w:ilvl w:val="0"/>
-          <w:numId w:val="1021"/>
+          <w:numId w:val="1022"/>
         </w:numPr>
       </w:pPr>
       <m:oMath>
@@ -5138,7 +5384,7 @@
         <w:pStyle w:val="Compact"/>
         <w:numPr>
           <w:ilvl w:val="0"/>
-          <w:numId w:val="1022"/>
+          <w:numId w:val="1023"/>
         </w:numPr>
       </w:pPr>
       <w:r>
@@ -5150,7 +5396,7 @@
         <w:pStyle w:val="Compact"/>
         <w:numPr>
           <w:ilvl w:val="0"/>
-          <w:numId w:val="1022"/>
+          <w:numId w:val="1023"/>
         </w:numPr>
       </w:pPr>
       <w:r>
@@ -5162,7 +5408,7 @@
         <w:pStyle w:val="Compact"/>
         <w:numPr>
           <w:ilvl w:val="0"/>
-          <w:numId w:val="1022"/>
+          <w:numId w:val="1023"/>
         </w:numPr>
       </w:pPr>
       <w:r>
@@ -5360,7 +5606,7 @@
         <w:pStyle w:val="Compact"/>
         <w:numPr>
           <w:ilvl w:val="0"/>
-          <w:numId w:val="1023"/>
+          <w:numId w:val="1024"/>
         </w:numPr>
       </w:pPr>
       <w:r>
@@ -5372,7 +5618,7 @@
         <w:pStyle w:val="Compact"/>
         <w:numPr>
           <w:ilvl w:val="0"/>
-          <w:numId w:val="1023"/>
+          <w:numId w:val="1024"/>
         </w:numPr>
       </w:pPr>
       <w:r>
@@ -5384,7 +5630,7 @@
         <w:pStyle w:val="Compact"/>
         <w:numPr>
           <w:ilvl w:val="0"/>
-          <w:numId w:val="1023"/>
+          <w:numId w:val="1024"/>
         </w:numPr>
       </w:pPr>
       <w:r>
@@ -5396,7 +5642,7 @@
         <w:pStyle w:val="Compact"/>
         <w:numPr>
           <w:ilvl w:val="0"/>
-          <w:numId w:val="1023"/>
+          <w:numId w:val="1024"/>
         </w:numPr>
       </w:pPr>
       <w:r>
@@ -5410,7 +5656,7 @@
       <w:r>
         <w:drawing>
           <wp:inline>
-            <wp:extent cx="2857500" cy="2381250"/>
+            <wp:extent cx="3638550" cy="2876550"/>
             <wp:effectExtent b="0" l="0" r="0" t="0"/>
             <wp:docPr descr="" title="" id="87" name="Picture"/>
             <a:graphic>
@@ -5431,7 +5677,7 @@
                   <pic:spPr bwMode="auto">
                     <a:xfrm>
                       <a:off x="0" y="0"/>
-                      <a:ext cx="2857500" cy="2381250"/>
+                      <a:ext cx="3638550" cy="2876550"/>
                     </a:xfrm>
                     <a:prstGeom prst="rect">
                       <a:avLst/>
@@ -5559,41 +5805,11 @@
         <w:pStyle w:val="Compact"/>
         <w:numPr>
           <w:ilvl w:val="0"/>
-          <w:numId w:val="1024"/>
-        </w:numPr>
-      </w:pPr>
-      <w:r>
-        <w:t xml:space="preserve">Interpret 95% CI to mean:</w:t>
-      </w:r>
-    </w:p>
-    <w:p>
-      <w:pPr>
-        <w:pStyle w:val="Compact"/>
-        <w:numPr>
-          <w:ilvl w:val="1"/>
           <w:numId w:val="1025"/>
         </w:numPr>
       </w:pPr>
       <w:r>
-        <w:t xml:space="preserve">Range of values that contains µ (population mean) with 95%</w:t>
-      </w:r>
-      <w:r>
-        <w:t xml:space="preserve"> </w:t>
-      </w:r>
-      <w:r>
-        <w:t xml:space="preserve">probability</w:t>
-      </w:r>
-    </w:p>
-    <w:p>
-      <w:pPr>
-        <w:pStyle w:val="Compact"/>
-        <w:numPr>
-          <w:ilvl w:val="0"/>
-          <w:numId w:val="1024"/>
-        </w:numPr>
-      </w:pPr>
-      <w:r>
-        <w:t xml:space="preserve">More correctly:</w:t>
+        <w:t xml:space="preserve">Interpret 95% CI to mean:</w:t>
       </w:r>
     </w:p>
     <w:p>
@@ -5605,7 +5821,25 @@
         </w:numPr>
       </w:pPr>
       <w:r>
-        <w:t xml:space="preserve">If we took 100 samples from population</w:t>
+        <w:t xml:space="preserve">Range of values that contains µ (population mean) with 95%</w:t>
+      </w:r>
+      <w:r>
+        <w:t xml:space="preserve"> </w:t>
+      </w:r>
+      <w:r>
+        <w:t xml:space="preserve">probability</w:t>
+      </w:r>
+    </w:p>
+    <w:p>
+      <w:pPr>
+        <w:pStyle w:val="Compact"/>
+        <w:numPr>
+          <w:ilvl w:val="0"/>
+          <w:numId w:val="1025"/>
+        </w:numPr>
+      </w:pPr>
+      <w:r>
+        <w:t xml:space="preserve">More correctly:</w:t>
       </w:r>
     </w:p>
     <w:p>
@@ -5613,11 +5847,11 @@
         <w:pStyle w:val="Compact"/>
         <w:numPr>
           <w:ilvl w:val="1"/>
-          <w:numId w:val="1026"/>
+          <w:numId w:val="1027"/>
         </w:numPr>
       </w:pPr>
       <w:r>
-        <w:t xml:space="preserve">calculate a CI from each</w:t>
+        <w:t xml:space="preserve">If we took 100 samples from population</w:t>
       </w:r>
     </w:p>
     <w:p>
@@ -5625,7 +5859,19 @@
         <w:pStyle w:val="Compact"/>
         <w:numPr>
           <w:ilvl w:val="1"/>
-          <w:numId w:val="1026"/>
+          <w:numId w:val="1027"/>
+        </w:numPr>
+      </w:pPr>
+      <w:r>
+        <w:t xml:space="preserve">calculate a CI from each</w:t>
+      </w:r>
+    </w:p>
+    <w:p>
+      <w:pPr>
+        <w:pStyle w:val="Compact"/>
+        <w:numPr>
+          <w:ilvl w:val="1"/>
+          <w:numId w:val="1027"/>
         </w:numPr>
       </w:pPr>
       <w:r>
@@ -6615,7 +6861,7 @@
         <w:pStyle w:val="Compact"/>
         <w:numPr>
           <w:ilvl w:val="0"/>
-          <w:numId w:val="1027"/>
+          <w:numId w:val="1028"/>
         </w:numPr>
       </w:pPr>
       <w:r>
@@ -6627,7 +6873,7 @@
         <w:pStyle w:val="Compact"/>
         <w:numPr>
           <w:ilvl w:val="0"/>
-          <w:numId w:val="1027"/>
+          <w:numId w:val="1028"/>
         </w:numPr>
       </w:pPr>
       <w:r>
@@ -6639,7 +6885,7 @@
         <w:pStyle w:val="Compact"/>
         <w:numPr>
           <w:ilvl w:val="0"/>
-          <w:numId w:val="1027"/>
+          <w:numId w:val="1028"/>
         </w:numPr>
       </w:pPr>
       <w:r>
@@ -6760,7 +7006,7 @@
         <w:pStyle w:val="Compact"/>
         <w:numPr>
           <w:ilvl w:val="0"/>
-          <w:numId w:val="1028"/>
+          <w:numId w:val="1029"/>
         </w:numPr>
       </w:pPr>
       <w:r>
@@ -6772,7 +7018,7 @@
         <w:pStyle w:val="Compact"/>
         <w:numPr>
           <w:ilvl w:val="0"/>
-          <w:numId w:val="1028"/>
+          <w:numId w:val="1029"/>
         </w:numPr>
       </w:pPr>
       <w:r>
@@ -6800,7 +7046,7 @@
         <w:pStyle w:val="Compact"/>
         <w:numPr>
           <w:ilvl w:val="0"/>
-          <w:numId w:val="1028"/>
+          <w:numId w:val="1029"/>
         </w:numPr>
       </w:pPr>
       <w:r>
@@ -6812,7 +7058,7 @@
         <w:pStyle w:val="Compact"/>
         <w:numPr>
           <w:ilvl w:val="0"/>
-          <w:numId w:val="1028"/>
+          <w:numId w:val="1029"/>
         </w:numPr>
       </w:pPr>
       <w:r>
@@ -6821,10 +7067,9 @@
     </w:p>
     <w:p>
       <w:pPr>
-        <w:pStyle w:val="Compact"/>
         <w:numPr>
           <w:ilvl w:val="1"/>
-          <w:numId w:val="1029"/>
+          <w:numId w:val="1030"/>
         </w:numPr>
       </w:pPr>
       <w:r>
@@ -6833,10 +7078,9 @@
     </w:p>
     <w:p>
       <w:pPr>
-        <w:pStyle w:val="Compact"/>
         <w:numPr>
           <w:ilvl w:val="1"/>
-          <w:numId w:val="1029"/>
+          <w:numId w:val="1030"/>
         </w:numPr>
       </w:pPr>
       <w:r>
@@ -6845,10 +7089,9 @@
     </w:p>
     <w:p>
       <w:pPr>
-        <w:pStyle w:val="Compact"/>
         <w:numPr>
           <w:ilvl w:val="1"/>
-          <w:numId w:val="1029"/>
+          <w:numId w:val="1030"/>
         </w:numPr>
       </w:pPr>
       <w:r>
@@ -6857,10 +7100,9 @@
     </w:p>
     <w:p>
       <w:pPr>
-        <w:pStyle w:val="Compact"/>
         <w:numPr>
           <w:ilvl w:val="1"/>
-          <w:numId w:val="1029"/>
+          <w:numId w:val="1030"/>
         </w:numPr>
       </w:pPr>
       <w:r>
@@ -8403,7 +8645,7 @@
         <w:pStyle w:val="Compact"/>
         <w:numPr>
           <w:ilvl w:val="0"/>
-          <w:numId w:val="1030"/>
+          <w:numId w:val="1031"/>
         </w:numPr>
       </w:pPr>
       <w:r>
@@ -8415,7 +8657,7 @@
         <w:pStyle w:val="Compact"/>
         <w:numPr>
           <w:ilvl w:val="0"/>
-          <w:numId w:val="1030"/>
+          <w:numId w:val="1031"/>
         </w:numPr>
       </w:pPr>
       <w:r>
@@ -8427,7 +8669,7 @@
         <w:pStyle w:val="Compact"/>
         <w:numPr>
           <w:ilvl w:val="0"/>
-          <w:numId w:val="1030"/>
+          <w:numId w:val="1031"/>
         </w:numPr>
       </w:pPr>
       <w:r>
@@ -8439,7 +8681,7 @@
         <w:pStyle w:val="Compact"/>
         <w:numPr>
           <w:ilvl w:val="0"/>
-          <w:numId w:val="1030"/>
+          <w:numId w:val="1031"/>
         </w:numPr>
       </w:pPr>
       <w:r>
@@ -8451,7 +8693,7 @@
         <w:pStyle w:val="Compact"/>
         <w:numPr>
           <w:ilvl w:val="0"/>
-          <w:numId w:val="1030"/>
+          <w:numId w:val="1031"/>
         </w:numPr>
       </w:pPr>
       <w:r>
@@ -8466,7 +8708,7 @@
       <w:r>
         <w:drawing>
           <wp:inline>
-            <wp:extent cx="2857500" cy="2381250"/>
+            <wp:extent cx="4762500" cy="3733800"/>
             <wp:effectExtent b="0" l="0" r="0" t="0"/>
             <wp:docPr descr="" title="" id="114" name="Picture"/>
             <a:graphic>
@@ -8487,7 +8729,7 @@
                   <pic:spPr bwMode="auto">
                     <a:xfrm>
                       <a:off x="0" y="0"/>
-                      <a:ext cx="2857500" cy="2381250"/>
+                      <a:ext cx="4762500" cy="3733800"/>
                     </a:xfrm>
                     <a:prstGeom prst="rect">
                       <a:avLst/>
@@ -8539,7 +8781,7 @@
         <w:pStyle w:val="Compact"/>
         <w:numPr>
           <w:ilvl w:val="0"/>
-          <w:numId w:val="1031"/>
+          <w:numId w:val="1032"/>
         </w:numPr>
       </w:pPr>
       <w:r>
@@ -8551,7 +8793,7 @@
         <w:pStyle w:val="Compact"/>
         <w:numPr>
           <w:ilvl w:val="0"/>
-          <w:numId w:val="1031"/>
+          <w:numId w:val="1032"/>
         </w:numPr>
       </w:pPr>
       <w:r>
@@ -8563,7 +8805,7 @@
         <w:pStyle w:val="Compact"/>
         <w:numPr>
           <w:ilvl w:val="0"/>
-          <w:numId w:val="1031"/>
+          <w:numId w:val="1032"/>
         </w:numPr>
       </w:pPr>
       <w:r>
@@ -8575,7 +8817,7 @@
         <w:pStyle w:val="Compact"/>
         <w:numPr>
           <w:ilvl w:val="0"/>
-          <w:numId w:val="1031"/>
+          <w:numId w:val="1032"/>
         </w:numPr>
       </w:pPr>
       <w:r>
@@ -8595,7 +8837,7 @@
       <w:r>
         <w:drawing>
           <wp:inline>
-            <wp:extent cx="2857500" cy="2381250"/>
+            <wp:extent cx="4762500" cy="3905250"/>
             <wp:effectExtent b="0" l="0" r="0" t="0"/>
             <wp:docPr descr="" title="" id="117" name="Picture"/>
             <a:graphic>
@@ -8616,7 +8858,7 @@
                   <pic:spPr bwMode="auto">
                     <a:xfrm>
                       <a:off x="0" y="0"/>
-                      <a:ext cx="2857500" cy="2381250"/>
+                      <a:ext cx="4762500" cy="3905250"/>
                     </a:xfrm>
                     <a:prstGeom prst="rect">
                       <a:avLst/>
@@ -8674,7 +8916,7 @@
         <w:pStyle w:val="Compact"/>
         <w:numPr>
           <w:ilvl w:val="0"/>
-          <w:numId w:val="1032"/>
+          <w:numId w:val="1033"/>
         </w:numPr>
       </w:pPr>
       <w:r>
@@ -8686,7 +8928,7 @@
         <w:pStyle w:val="Compact"/>
         <w:numPr>
           <w:ilvl w:val="0"/>
-          <w:numId w:val="1032"/>
+          <w:numId w:val="1033"/>
         </w:numPr>
       </w:pPr>
       <w:r>
@@ -8747,7 +8989,7 @@
       <w:r>
         <w:drawing>
           <wp:inline>
-            <wp:extent cx="2667000" cy="1905000"/>
+            <wp:extent cx="3924300" cy="2943225"/>
             <wp:effectExtent b="0" l="0" r="0" t="0"/>
             <wp:docPr descr="" title="" id="124" name="Picture"/>
             <a:graphic>
@@ -8768,7 +9010,7 @@
                   <pic:spPr bwMode="auto">
                     <a:xfrm>
                       <a:off x="0" y="0"/>
-                      <a:ext cx="2667000" cy="1905000"/>
+                      <a:ext cx="3924300" cy="2943225"/>
                     </a:xfrm>
                     <a:prstGeom prst="rect">
                       <a:avLst/>
@@ -8820,7 +9062,7 @@
         <w:pStyle w:val="Compact"/>
         <w:numPr>
           <w:ilvl w:val="0"/>
-          <w:numId w:val="1033"/>
+          <w:numId w:val="1034"/>
         </w:numPr>
       </w:pPr>
       <w:r>
@@ -8832,7 +9074,7 @@
         <w:pStyle w:val="Compact"/>
         <w:numPr>
           <w:ilvl w:val="0"/>
-          <w:numId w:val="1033"/>
+          <w:numId w:val="1034"/>
         </w:numPr>
       </w:pPr>
       <w:r>
@@ -8893,7 +9135,7 @@
       <w:r>
         <w:drawing>
           <wp:inline>
-            <wp:extent cx="3333750" cy="1905000"/>
+            <wp:extent cx="4219575" cy="2838450"/>
             <wp:effectExtent b="0" l="0" r="0" t="0"/>
             <wp:docPr descr="" title="" id="131" name="Picture"/>
             <a:graphic>
@@ -8914,7 +9156,7 @@
                   <pic:spPr bwMode="auto">
                     <a:xfrm>
                       <a:off x="0" y="0"/>
-                      <a:ext cx="3333750" cy="1905000"/>
+                      <a:ext cx="4219575" cy="2838450"/>
                     </a:xfrm>
                     <a:prstGeom prst="rect">
                       <a:avLst/>
@@ -8974,7 +9216,7 @@
         <w:pStyle w:val="Compact"/>
         <w:numPr>
           <w:ilvl w:val="0"/>
-          <w:numId w:val="1034"/>
+          <w:numId w:val="1035"/>
         </w:numPr>
       </w:pPr>
       <w:r>
@@ -8986,7 +9228,7 @@
         <w:pStyle w:val="Compact"/>
         <w:numPr>
           <w:ilvl w:val="0"/>
-          <w:numId w:val="1034"/>
+          <w:numId w:val="1035"/>
         </w:numPr>
       </w:pPr>
       <w:r>
@@ -8998,7 +9240,7 @@
         <w:pStyle w:val="Compact"/>
         <w:numPr>
           <w:ilvl w:val="0"/>
-          <w:numId w:val="1034"/>
+          <w:numId w:val="1035"/>
         </w:numPr>
       </w:pPr>
       <w:r>
@@ -9012,7 +9254,7 @@
       <w:r>
         <w:drawing>
           <wp:inline>
-            <wp:extent cx="3333750" cy="2667000"/>
+            <wp:extent cx="4762500" cy="3467100"/>
             <wp:effectExtent b="0" l="0" r="0" t="0"/>
             <wp:docPr descr="" title="" id="135" name="Picture"/>
             <a:graphic>
@@ -9033,7 +9275,7 @@
                   <pic:spPr bwMode="auto">
                     <a:xfrm>
                       <a:off x="0" y="0"/>
-                      <a:ext cx="3333750" cy="2667000"/>
+                      <a:ext cx="4762500" cy="3467100"/>
                     </a:xfrm>
                     <a:prstGeom prst="rect">
                       <a:avLst/>
@@ -9102,7 +9344,7 @@
       <w:pPr>
         <w:numPr>
           <w:ilvl w:val="0"/>
-          <w:numId w:val="1035"/>
+          <w:numId w:val="1036"/>
         </w:numPr>
       </w:pPr>
       <w:r>
@@ -9144,7 +9386,7 @@
       <w:pPr>
         <w:numPr>
           <w:ilvl w:val="0"/>
-          <w:numId w:val="1035"/>
+          <w:numId w:val="1036"/>
         </w:numPr>
       </w:pPr>
       <w:r>
@@ -9162,7 +9404,7 @@
       <w:pPr>
         <w:numPr>
           <w:ilvl w:val="0"/>
-          <w:numId w:val="1035"/>
+          <w:numId w:val="1036"/>
         </w:numPr>
       </w:pPr>
       <w:r>
@@ -9180,7 +9422,7 @@
       <w:pPr>
         <w:numPr>
           <w:ilvl w:val="0"/>
-          <w:numId w:val="1035"/>
+          <w:numId w:val="1036"/>
         </w:numPr>
       </w:pPr>
       <w:r>
@@ -9204,7 +9446,7 @@
       <w:pPr>
         <w:numPr>
           <w:ilvl w:val="0"/>
-          <w:numId w:val="1035"/>
+          <w:numId w:val="1036"/>
         </w:numPr>
       </w:pPr>
       <w:r>
@@ -9334,9 +9576,10 @@
     </w:p>
     <w:p>
       <w:pPr>
+        <w:pStyle w:val="Compact"/>
         <w:numPr>
           <w:ilvl w:val="0"/>
-          <w:numId w:val="1036"/>
+          <w:numId w:val="1037"/>
         </w:numPr>
       </w:pPr>
       <w:r>
@@ -9376,9 +9619,10 @@
     </w:p>
     <w:p>
       <w:pPr>
+        <w:pStyle w:val="Compact"/>
         <w:numPr>
           <w:ilvl w:val="0"/>
-          <w:numId w:val="1036"/>
+          <w:numId w:val="1037"/>
         </w:numPr>
       </w:pPr>
       <w:r>
@@ -9394,9 +9638,10 @@
     </w:p>
     <w:p>
       <w:pPr>
+        <w:pStyle w:val="Compact"/>
         <w:numPr>
           <w:ilvl w:val="0"/>
-          <w:numId w:val="1036"/>
+          <w:numId w:val="1037"/>
         </w:numPr>
       </w:pPr>
       <w:r>
@@ -9412,9 +9657,10 @@
     </w:p>
     <w:p>
       <w:pPr>
+        <w:pStyle w:val="Compact"/>
         <w:numPr>
           <w:ilvl w:val="0"/>
-          <w:numId w:val="1036"/>
+          <w:numId w:val="1037"/>
         </w:numPr>
       </w:pPr>
       <w:r>
@@ -9436,9 +9682,10 @@
     </w:p>
     <w:p>
       <w:pPr>
+        <w:pStyle w:val="Compact"/>
         <w:numPr>
           <w:ilvl w:val="0"/>
-          <w:numId w:val="1036"/>
+          <w:numId w:val="1037"/>
         </w:numPr>
       </w:pPr>
       <w:r>
@@ -9646,7 +9893,7 @@
               <w:t xml:space="preserve"> </w:t>
             </w:r>
             <w:r>
-              <w:t xml:space="preserve">in Toolik Lake differs from 50 mm:</w:t>
+              <w:t xml:space="preserve">in Lake I3 differs from 260 mm:</w:t>
             </w:r>
           </w:p>
           <w:p>
@@ -10087,7 +10334,7 @@
               <w:pStyle w:val="Compact"/>
               <w:numPr>
                 <w:ilvl w:val="0"/>
-                <w:numId w:val="1037"/>
+                <w:numId w:val="1038"/>
               </w:numPr>
             </w:pPr>
             <w:r>
@@ -10099,7 +10346,7 @@
               <w:pStyle w:val="Compact"/>
               <w:numPr>
                 <w:ilvl w:val="0"/>
-                <w:numId w:val="1037"/>
+                <w:numId w:val="1038"/>
               </w:numPr>
             </w:pPr>
             <w:r>
@@ -10111,7 +10358,7 @@
               <w:pStyle w:val="Compact"/>
               <w:numPr>
                 <w:ilvl w:val="0"/>
-                <w:numId w:val="1037"/>
+                <w:numId w:val="1038"/>
               </w:numPr>
             </w:pPr>
             <w:r>
@@ -10123,7 +10370,7 @@
               <w:pStyle w:val="Compact"/>
               <w:numPr>
                 <w:ilvl w:val="0"/>
-                <w:numId w:val="1037"/>
+                <w:numId w:val="1038"/>
               </w:numPr>
             </w:pPr>
             <w:r>
@@ -10135,7 +10382,7 @@
               <w:pStyle w:val="Compact"/>
               <w:numPr>
                 <w:ilvl w:val="0"/>
-                <w:numId w:val="1037"/>
+                <w:numId w:val="1038"/>
               </w:numPr>
             </w:pPr>
             <w:r>
@@ -10285,7 +10532,7 @@
               <w:pStyle w:val="Compact"/>
               <w:numPr>
                 <w:ilvl w:val="0"/>
-                <w:numId w:val="1038"/>
+                <w:numId w:val="1039"/>
               </w:numPr>
             </w:pPr>
             <w:r>
@@ -10297,7 +10544,7 @@
               <w:pStyle w:val="Compact"/>
               <w:numPr>
                 <w:ilvl w:val="0"/>
-                <w:numId w:val="1038"/>
+                <w:numId w:val="1039"/>
               </w:numPr>
             </w:pPr>
             <w:r>
@@ -10315,7 +10562,7 @@
               <w:pStyle w:val="Compact"/>
               <w:numPr>
                 <w:ilvl w:val="0"/>
-                <w:numId w:val="1038"/>
+                <w:numId w:val="1039"/>
               </w:numPr>
             </w:pPr>
             <w:r>
@@ -10632,28 +10879,46 @@
         </w:rPr>
         <w:t xml:space="preserve">Common interpretations:</w:t>
       </w:r>
-      <w:r>
-        <w:t xml:space="preserve"> </w:t>
-      </w:r>
-      <w:r>
-        <w:t xml:space="preserve">- p &lt; 0.05: Strong evidence against H₀ -</w:t>
-      </w:r>
-      <w:r>
-        <w:t xml:space="preserve"> </w:t>
-      </w:r>
-      <w:r>
-        <w:t xml:space="preserve">0.05 ≤ p &lt; 0.10: Moderate evidence against H₀ - p ≥ 0.10: Insufficient</w:t>
-      </w:r>
-      <w:r>
-        <w:t xml:space="preserve"> </w:t>
-      </w:r>
-      <w:r>
-        <w:t xml:space="preserve">evidence against H₀</w:t>
-      </w:r>
-    </w:p>
-    <w:p>
-      <w:pPr>
-        <w:pStyle w:val="BodyText"/>
+    </w:p>
+    <w:p>
+      <w:pPr>
+        <w:pStyle w:val="Compact"/>
+        <w:numPr>
+          <w:ilvl w:val="0"/>
+          <w:numId w:val="1040"/>
+        </w:numPr>
+      </w:pPr>
+      <w:r>
+        <w:t xml:space="preserve">- p &lt; 0.05: Strong evidence against H₀</w:t>
+      </w:r>
+    </w:p>
+    <w:p>
+      <w:pPr>
+        <w:pStyle w:val="Compact"/>
+        <w:numPr>
+          <w:ilvl w:val="0"/>
+          <w:numId w:val="1040"/>
+        </w:numPr>
+      </w:pPr>
+      <w:r>
+        <w:t xml:space="preserve">- 0.05 ≤ p &lt; 0.10: Moderate evidence against H₀</w:t>
+      </w:r>
+    </w:p>
+    <w:p>
+      <w:pPr>
+        <w:pStyle w:val="Compact"/>
+        <w:numPr>
+          <w:ilvl w:val="0"/>
+          <w:numId w:val="1040"/>
+        </w:numPr>
+      </w:pPr>
+      <w:r>
+        <w:t xml:space="preserve">- p ≥ 0.10: Insufficient evidence against H₀</w:t>
+      </w:r>
+    </w:p>
+    <w:p>
+      <w:pPr>
+        <w:pStyle w:val="FirstParagraph"/>
       </w:pPr>
       <w:r>
         <w:rPr>
@@ -10662,28 +10927,46 @@
         </w:rPr>
         <w:t xml:space="preserve">Common misinterpretations:</w:t>
       </w:r>
-      <w:r>
-        <w:t xml:space="preserve"> </w:t>
-      </w:r>
-      <w:r>
-        <w:t xml:space="preserve">- p-value is NOT the probability that H₀</w:t>
-      </w:r>
-      <w:r>
-        <w:t xml:space="preserve"> </w:t>
-      </w:r>
-      <w:r>
-        <w:t xml:space="preserve">is true - p-value is NOT the probability that results occurred by</w:t>
-      </w:r>
-      <w:r>
-        <w:t xml:space="preserve"> </w:t>
-      </w:r>
-      <w:r>
-        <w:t xml:space="preserve">chance - Statistical significance ≠ practical significance</w:t>
-      </w:r>
-    </w:p>
-    <w:p>
-      <w:pPr>
-        <w:pStyle w:val="BodyText"/>
+    </w:p>
+    <w:p>
+      <w:pPr>
+        <w:pStyle w:val="Compact"/>
+        <w:numPr>
+          <w:ilvl w:val="0"/>
+          <w:numId w:val="1041"/>
+        </w:numPr>
+      </w:pPr>
+      <w:r>
+        <w:t xml:space="preserve">- p-value is NOT the probability that H₀ is true</w:t>
+      </w:r>
+    </w:p>
+    <w:p>
+      <w:pPr>
+        <w:pStyle w:val="Compact"/>
+        <w:numPr>
+          <w:ilvl w:val="0"/>
+          <w:numId w:val="1041"/>
+        </w:numPr>
+      </w:pPr>
+      <w:r>
+        <w:t xml:space="preserve">- p-value is NOT the probability that results occurred by chance</w:t>
+      </w:r>
+    </w:p>
+    <w:p>
+      <w:pPr>
+        <w:pStyle w:val="Compact"/>
+        <w:numPr>
+          <w:ilvl w:val="0"/>
+          <w:numId w:val="1041"/>
+        </w:numPr>
+      </w:pPr>
+      <w:r>
+        <w:t xml:space="preserve">- Statistical significance ≠ practical significance</w:t>
+      </w:r>
+    </w:p>
+    <w:p>
+      <w:pPr>
+        <w:pStyle w:val="FirstParagraph"/>
       </w:pPr>
       <w:r>
         <w:drawing>
@@ -11038,7 +11321,7 @@
             <w:pPr>
               <w:numPr>
                 <w:ilvl w:val="0"/>
-                <w:numId w:val="1039"/>
+                <w:numId w:val="1042"/>
               </w:numPr>
             </w:pPr>
             <w:r>
@@ -11055,7 +11338,7 @@
             <w:pPr>
               <w:numPr>
                 <w:ilvl w:val="0"/>
-                <w:numId w:val="1039"/>
+                <w:numId w:val="1042"/>
               </w:numPr>
             </w:pPr>
             <w:r>
@@ -11072,7 +11355,7 @@
             <w:pPr>
               <w:numPr>
                 <w:ilvl w:val="0"/>
-                <w:numId w:val="1039"/>
+                <w:numId w:val="1042"/>
               </w:numPr>
             </w:pPr>
             <w:r>
@@ -12008,7 +12291,7 @@
         <w:pStyle w:val="Compact"/>
         <w:numPr>
           <w:ilvl w:val="0"/>
-          <w:numId w:val="1040"/>
+          <w:numId w:val="1043"/>
         </w:numPr>
       </w:pPr>
       <w:r>
@@ -12023,153 +12306,6 @@
       </w:r>
       <w:r>
         <w:t xml:space="preserve">model random phenomena</w:t>
-      </w:r>
-    </w:p>
-    <w:p>
-      <w:pPr>
-        <w:pStyle w:val="Compact"/>
-        <w:numPr>
-          <w:ilvl w:val="1"/>
-          <w:numId w:val="1041"/>
-        </w:numPr>
-      </w:pPr>
-      <w:r>
-        <w:t xml:space="preserve">Normal distribution is especially important</w:t>
-      </w:r>
-    </w:p>
-    <w:p>
-      <w:pPr>
-        <w:pStyle w:val="Compact"/>
-        <w:numPr>
-          <w:ilvl w:val="1"/>
-          <w:numId w:val="1041"/>
-        </w:numPr>
-      </w:pPr>
-      <w:r>
-        <w:t xml:space="preserve">Z-scores standardize measurements</w:t>
-      </w:r>
-    </w:p>
-    <w:p>
-      <w:pPr>
-        <w:pStyle w:val="Compact"/>
-        <w:numPr>
-          <w:ilvl w:val="0"/>
-          <w:numId w:val="1040"/>
-        </w:numPr>
-      </w:pPr>
-      <w:r>
-        <w:rPr>
-          <w:b/>
-          <w:bCs/>
-        </w:rPr>
-        <w:t xml:space="preserve">Standard error</w:t>
-      </w:r>
-      <w:r>
-        <w:t xml:space="preserve"> </w:t>
-      </w:r>
-      <w:r>
-        <w:t xml:space="preserve">measures precision of estimates</w:t>
-      </w:r>
-    </w:p>
-    <w:p>
-      <w:pPr>
-        <w:pStyle w:val="Compact"/>
-        <w:numPr>
-          <w:ilvl w:val="1"/>
-          <w:numId w:val="1042"/>
-        </w:numPr>
-      </w:pPr>
-      <w:r>
-        <w:t xml:space="preserve">Decreases with larger sample sizes</w:t>
-      </w:r>
-    </w:p>
-    <w:p>
-      <w:pPr>
-        <w:pStyle w:val="Compact"/>
-        <w:numPr>
-          <w:ilvl w:val="1"/>
-          <w:numId w:val="1042"/>
-        </w:numPr>
-      </w:pPr>
-      <w:r>
-        <w:t xml:space="preserve">Used to construct confidence intervals</w:t>
-      </w:r>
-    </w:p>
-    <w:p>
-      <w:pPr>
-        <w:pStyle w:val="Compact"/>
-        <w:numPr>
-          <w:ilvl w:val="0"/>
-          <w:numId w:val="1040"/>
-        </w:numPr>
-      </w:pPr>
-      <w:r>
-        <w:rPr>
-          <w:b/>
-          <w:bCs/>
-        </w:rPr>
-        <w:t xml:space="preserve">Confidence intervals</w:t>
-      </w:r>
-      <w:r>
-        <w:t xml:space="preserve"> </w:t>
-      </w:r>
-      <w:r>
-        <w:t xml:space="preserve">express uncertainty</w:t>
-      </w:r>
-    </w:p>
-    <w:p>
-      <w:pPr>
-        <w:pStyle w:val="Compact"/>
-        <w:numPr>
-          <w:ilvl w:val="1"/>
-          <w:numId w:val="1043"/>
-        </w:numPr>
-      </w:pPr>
-      <w:r>
-        <w:t xml:space="preserve">Provide plausible range for parameters</w:t>
-      </w:r>
-    </w:p>
-    <w:p>
-      <w:pPr>
-        <w:pStyle w:val="Compact"/>
-        <w:numPr>
-          <w:ilvl w:val="1"/>
-          <w:numId w:val="1043"/>
-        </w:numPr>
-      </w:pPr>
-      <w:r>
-        <w:t xml:space="preserve">95% CI:</w:t>
-      </w:r>
-      <w:r>
-        <w:t xml:space="preserve"> </w:t>
-      </w:r>
-      <w:r>
-        <w:rPr>
-          <w:rStyle w:val="VerbatimChar"/>
-        </w:rPr>
-        <w:t xml:space="preserve">mean ± 1.96 × SE</w:t>
-      </w:r>
-    </w:p>
-    <w:p>
-      <w:pPr>
-        <w:pStyle w:val="Compact"/>
-        <w:numPr>
-          <w:ilvl w:val="0"/>
-          <w:numId w:val="1040"/>
-        </w:numPr>
-      </w:pPr>
-      <w:r>
-        <w:rPr>
-          <w:b/>
-          <w:bCs/>
-        </w:rPr>
-        <w:t xml:space="preserve">Hypothesis testing</w:t>
-      </w:r>
-      <w:r>
-        <w:t xml:space="preserve"> </w:t>
-      </w:r>
-      <w:r>
-        <w:t xml:space="preserve">evaluates claims</w:t>
       </w:r>
     </w:p>
     <w:p>
@@ -12181,7 +12317,7 @@
         </w:numPr>
       </w:pPr>
       <w:r>
-        <w:t xml:space="preserve">Null vs. alternative hypotheses</w:t>
+        <w:t xml:space="preserve">Normal distribution is especially important</w:t>
       </w:r>
     </w:p>
     <w:p>
@@ -12193,7 +12329,29 @@
         </w:numPr>
       </w:pPr>
       <w:r>
-        <w:t xml:space="preserve">P-values quantify evidence against H₀</w:t>
+        <w:t xml:space="preserve">Z-scores standardize measurements</w:t>
+      </w:r>
+    </w:p>
+    <w:p>
+      <w:pPr>
+        <w:pStyle w:val="Compact"/>
+        <w:numPr>
+          <w:ilvl w:val="0"/>
+          <w:numId w:val="1043"/>
+        </w:numPr>
+      </w:pPr>
+      <w:r>
+        <w:rPr>
+          <w:b/>
+          <w:bCs/>
+        </w:rPr>
+        <w:t xml:space="preserve">Standard error</w:t>
+      </w:r>
+      <w:r>
+        <w:t xml:space="preserve"> </w:t>
+      </w:r>
+      <w:r>
+        <w:t xml:space="preserve">measures precision of estimates</w:t>
       </w:r>
     </w:p>
     <w:p>
@@ -12201,7 +12359,132 @@
         <w:pStyle w:val="Compact"/>
         <w:numPr>
           <w:ilvl w:val="1"/>
-          <w:numId w:val="1044"/>
+          <w:numId w:val="1045"/>
+        </w:numPr>
+      </w:pPr>
+      <w:r>
+        <w:t xml:space="preserve">Decreases with larger sample sizes</w:t>
+      </w:r>
+    </w:p>
+    <w:p>
+      <w:pPr>
+        <w:pStyle w:val="Compact"/>
+        <w:numPr>
+          <w:ilvl w:val="1"/>
+          <w:numId w:val="1045"/>
+        </w:numPr>
+      </w:pPr>
+      <w:r>
+        <w:t xml:space="preserve">Used to construct confidence intervals</w:t>
+      </w:r>
+    </w:p>
+    <w:p>
+      <w:pPr>
+        <w:pStyle w:val="Compact"/>
+        <w:numPr>
+          <w:ilvl w:val="0"/>
+          <w:numId w:val="1043"/>
+        </w:numPr>
+      </w:pPr>
+      <w:r>
+        <w:rPr>
+          <w:b/>
+          <w:bCs/>
+        </w:rPr>
+        <w:t xml:space="preserve">Confidence intervals</w:t>
+      </w:r>
+      <w:r>
+        <w:t xml:space="preserve"> </w:t>
+      </w:r>
+      <w:r>
+        <w:t xml:space="preserve">express uncertainty</w:t>
+      </w:r>
+    </w:p>
+    <w:p>
+      <w:pPr>
+        <w:pStyle w:val="Compact"/>
+        <w:numPr>
+          <w:ilvl w:val="1"/>
+          <w:numId w:val="1046"/>
+        </w:numPr>
+      </w:pPr>
+      <w:r>
+        <w:t xml:space="preserve">Provide plausible range for parameters</w:t>
+      </w:r>
+    </w:p>
+    <w:p>
+      <w:pPr>
+        <w:pStyle w:val="Compact"/>
+        <w:numPr>
+          <w:ilvl w:val="1"/>
+          <w:numId w:val="1046"/>
+        </w:numPr>
+      </w:pPr>
+      <w:r>
+        <w:t xml:space="preserve">95% CI:</w:t>
+      </w:r>
+      <w:r>
+        <w:t xml:space="preserve"> </w:t>
+      </w:r>
+      <w:r>
+        <w:rPr>
+          <w:rStyle w:val="VerbatimChar"/>
+        </w:rPr>
+        <w:t xml:space="preserve">mean ± 1.96 × SE</w:t>
+      </w:r>
+    </w:p>
+    <w:p>
+      <w:pPr>
+        <w:pStyle w:val="Compact"/>
+        <w:numPr>
+          <w:ilvl w:val="0"/>
+          <w:numId w:val="1043"/>
+        </w:numPr>
+      </w:pPr>
+      <w:r>
+        <w:rPr>
+          <w:b/>
+          <w:bCs/>
+        </w:rPr>
+        <w:t xml:space="preserve">Hypothesis testing</w:t>
+      </w:r>
+      <w:r>
+        <w:t xml:space="preserve"> </w:t>
+      </w:r>
+      <w:r>
+        <w:t xml:space="preserve">evaluates claims</w:t>
+      </w:r>
+    </w:p>
+    <w:p>
+      <w:pPr>
+        <w:pStyle w:val="Compact"/>
+        <w:numPr>
+          <w:ilvl w:val="1"/>
+          <w:numId w:val="1047"/>
+        </w:numPr>
+      </w:pPr>
+      <w:r>
+        <w:t xml:space="preserve">Null vs. alternative hypotheses</w:t>
+      </w:r>
+    </w:p>
+    <w:p>
+      <w:pPr>
+        <w:pStyle w:val="Compact"/>
+        <w:numPr>
+          <w:ilvl w:val="1"/>
+          <w:numId w:val="1047"/>
+        </w:numPr>
+      </w:pPr>
+      <w:r>
+        <w:t xml:space="preserve">P-values quantify evidence against H₀</w:t>
+      </w:r>
+    </w:p>
+    <w:p>
+      <w:pPr>
+        <w:pStyle w:val="Compact"/>
+        <w:numPr>
+          <w:ilvl w:val="1"/>
+          <w:numId w:val="1047"/>
         </w:numPr>
       </w:pPr>
       <w:r>
@@ -12661,34 +12944,7 @@
     <w:abstractNumId w:val="991"/>
   </w:num>
   <w:num w:numId="1035">
-    <w:abstractNumId w:val="99411"/>
-    <w:lvlOverride w:ilvl="0">
-      <w:startOverride w:val="1"/>
-    </w:lvlOverride>
-    <w:lvlOverride w:ilvl="1">
-      <w:startOverride w:val="1"/>
-    </w:lvlOverride>
-    <w:lvlOverride w:ilvl="2">
-      <w:startOverride w:val="1"/>
-    </w:lvlOverride>
-    <w:lvlOverride w:ilvl="3">
-      <w:startOverride w:val="1"/>
-    </w:lvlOverride>
-    <w:lvlOverride w:ilvl="4">
-      <w:startOverride w:val="1"/>
-    </w:lvlOverride>
-    <w:lvlOverride w:ilvl="5">
-      <w:startOverride w:val="1"/>
-    </w:lvlOverride>
-    <w:lvlOverride w:ilvl="6">
-      <w:startOverride w:val="1"/>
-    </w:lvlOverride>
-    <w:lvlOverride w:ilvl="7">
-      <w:startOverride w:val="1"/>
-    </w:lvlOverride>
-    <w:lvlOverride w:ilvl="8">
-      <w:startOverride w:val="1"/>
-    </w:lvlOverride>
+    <w:abstractNumId w:val="991"/>
   </w:num>
   <w:num w:numId="1036">
     <w:abstractNumId w:val="99411"/>
@@ -12811,6 +13067,12 @@
     </w:lvlOverride>
   </w:num>
   <w:num w:numId="1040">
+    <w:abstractNumId w:val="991"/>
+  </w:num>
+  <w:num w:numId="1041">
+    <w:abstractNumId w:val="991"/>
+  </w:num>
+  <w:num w:numId="1042">
     <w:abstractNumId w:val="99411"/>
     <w:lvlOverride w:ilvl="0">
       <w:startOverride w:val="1"/>
@@ -12840,16 +13102,46 @@
       <w:startOverride w:val="1"/>
     </w:lvlOverride>
   </w:num>
-  <w:num w:numId="1041">
+  <w:num w:numId="1043">
+    <w:abstractNumId w:val="99411"/>
+    <w:lvlOverride w:ilvl="0">
+      <w:startOverride w:val="1"/>
+    </w:lvlOverride>
+    <w:lvlOverride w:ilvl="1">
+      <w:startOverride w:val="1"/>
+    </w:lvlOverride>
+    <w:lvlOverride w:ilvl="2">
+      <w:startOverride w:val="1"/>
+    </w:lvlOverride>
+    <w:lvlOverride w:ilvl="3">
+      <w:startOverride w:val="1"/>
+    </w:lvlOverride>
+    <w:lvlOverride w:ilvl="4">
+      <w:startOverride w:val="1"/>
+    </w:lvlOverride>
+    <w:lvlOverride w:ilvl="5">
+      <w:startOverride w:val="1"/>
+    </w:lvlOverride>
+    <w:lvlOverride w:ilvl="6">
+      <w:startOverride w:val="1"/>
+    </w:lvlOverride>
+    <w:lvlOverride w:ilvl="7">
+      <w:startOverride w:val="1"/>
+    </w:lvlOverride>
+    <w:lvlOverride w:ilvl="8">
+      <w:startOverride w:val="1"/>
+    </w:lvlOverride>
+  </w:num>
+  <w:num w:numId="1044">
     <w:abstractNumId w:val="991"/>
   </w:num>
-  <w:num w:numId="1042">
+  <w:num w:numId="1045">
     <w:abstractNumId w:val="991"/>
   </w:num>
-  <w:num w:numId="1043">
+  <w:num w:numId="1046">
     <w:abstractNumId w:val="991"/>
   </w:num>
-  <w:num w:numId="1044">
+  <w:num w:numId="1047">
     <w:abstractNumId w:val="991"/>
   </w:num>
 </w:numbering>

</xml_diff>

<commit_message>
fixed 4 need to fix 4 activity
</commit_message>
<xml_diff>
--- a/docs/ecostats_lectures/lecture_04/04_01_lecture_powerpoint.docx
+++ b/docs/ecostats_lectures/lecture_04/04_01_lecture_powerpoint.docx
@@ -3322,67 +3322,61 @@
         <w:br/>
       </w:r>
       <w:r>
+        <w:rPr>
+          <w:rStyle w:val="CommentTok"/>
+        </w:rPr>
+        <w:t xml:space="preserve"># To find z-value for a given probability:</w:t>
+      </w:r>
+      <w:r>
         <w:br/>
       </w:r>
       <w:r>
         <w:rPr>
+          <w:rStyle w:val="NormalTok"/>
+        </w:rPr>
+        <w:t xml:space="preserve">z_for_95_percent </w:t>
+      </w:r>
+      <w:r>
+        <w:rPr>
+          <w:rStyle w:val="OtherTok"/>
+        </w:rPr>
+        <w:t xml:space="preserve">&lt;-</w:t>
+      </w:r>
+      <w:r>
+        <w:rPr>
+          <w:rStyle w:val="NormalTok"/>
+        </w:rPr>
+        <w:t xml:space="preserve"> </w:t>
+      </w:r>
+      <w:r>
+        <w:rPr>
+          <w:rStyle w:val="FunctionTok"/>
+        </w:rPr>
+        <w:t xml:space="preserve">qnorm</w:t>
+      </w:r>
+      <w:r>
+        <w:rPr>
+          <w:rStyle w:val="NormalTok"/>
+        </w:rPr>
+        <w:t xml:space="preserve">(</w:t>
+      </w:r>
+      <w:r>
+        <w:rPr>
+          <w:rStyle w:val="FloatTok"/>
+        </w:rPr>
+        <w:t xml:space="preserve">0.888</w:t>
+      </w:r>
+      <w:r>
+        <w:rPr>
+          <w:rStyle w:val="NormalTok"/>
+        </w:rPr>
+        <w:t xml:space="preserve">)     </w:t>
+      </w:r>
+      <w:r>
+        <w:rPr>
           <w:rStyle w:val="CommentTok"/>
         </w:rPr>
-        <w:t xml:space="preserve"># To find z-value for a given probability:</w:t>
-      </w:r>
-      <w:r>
-        <w:br/>
-      </w:r>
-      <w:r>
-        <w:rPr>
-          <w:rStyle w:val="NormalTok"/>
-        </w:rPr>
-        <w:t xml:space="preserve">z_for_95_percent </w:t>
-      </w:r>
-      <w:r>
-        <w:rPr>
-          <w:rStyle w:val="OtherTok"/>
-        </w:rPr>
-        <w:t xml:space="preserve">&lt;-</w:t>
-      </w:r>
-      <w:r>
-        <w:rPr>
-          <w:rStyle w:val="NormalTok"/>
-        </w:rPr>
-        <w:t xml:space="preserve"> </w:t>
-      </w:r>
-      <w:r>
-        <w:rPr>
-          <w:rStyle w:val="FunctionTok"/>
-        </w:rPr>
-        <w:t xml:space="preserve">qnorm</w:t>
-      </w:r>
-      <w:r>
-        <w:rPr>
-          <w:rStyle w:val="NormalTok"/>
-        </w:rPr>
-        <w:t xml:space="preserve">(</w:t>
-      </w:r>
-      <w:r>
-        <w:rPr>
-          <w:rStyle w:val="FloatTok"/>
-        </w:rPr>
-        <w:t xml:space="preserve">0.888</w:t>
-      </w:r>
-      <w:r>
-        <w:rPr>
-          <w:rStyle w:val="NormalTok"/>
-        </w:rPr>
-        <w:t xml:space="preserve">)     </w:t>
-      </w:r>
-      <w:r>
-        <w:rPr>
-          <w:rStyle w:val="CommentTok"/>
-        </w:rPr>
         <w:t xml:space="preserve"># 1.96</w:t>
-      </w:r>
-      <w:r>
-        <w:br/>
       </w:r>
       <w:r>
         <w:br/>
@@ -5182,7 +5176,7 @@
       </w:r>
     </w:p>
     <w:bookmarkEnd w:id="111"/>
-    <w:bookmarkStart w:id="114" w:name="X778e819be2241fac1d829fce675f6db2cdbd9e4"/>
+    <w:bookmarkStart w:id="116" w:name="X778e819be2241fac1d829fce675f6db2cdbd9e4"/>
     <w:p>
       <w:pPr>
         <w:pStyle w:val="Heading1"/>
@@ -5313,7 +5307,228 @@
               <w:t xml:space="preserve"> </w:t>
             </w:r>
             <w:r>
-              <w:t xml:space="preserve">266.7 - sd is 17.12 - se is 5.41 ##</w:t>
+              <w:t xml:space="preserve">266.7 - sd is 17.12 - se is 5.41</w:t>
+            </w:r>
+          </w:p>
+          <w:p>
+            <w:pPr>
+              <w:pStyle w:val="BodyText"/>
+            </w:pPr>
+            <w:pPr>
+              <w:spacing w:after="16"/>
+            </w:pPr>
+            <w:r>
+              <w:t xml:space="preserve">##</w:t>
+            </w:r>
+            <w:r>
+              <w:t xml:space="preserve"> </w:t>
+            </w:r>
+            <m:oMath>
+              <m:r>
+                <m:rPr>
+                  <m:nor/>
+                  <m:sty m:val="p"/>
+                </m:rPr>
+                <m:t>CI</m:t>
+              </m:r>
+              <m:r>
+                <m:rPr>
+                  <m:sty m:val="p"/>
+                </m:rPr>
+                <m:t>=</m:t>
+              </m:r>
+              <m:acc>
+                <m:accPr>
+                  <m:chr m:val="‾"/>
+                </m:accPr>
+                <m:e>
+                  <m:r>
+                    <m:t>y</m:t>
+                  </m:r>
+                </m:e>
+              </m:acc>
+              <m:r>
+                <m:rPr>
+                  <m:sty m:val="p"/>
+                </m:rPr>
+                <m:t>±</m:t>
+              </m:r>
+              <m:r>
+                <m:t>t</m:t>
+              </m:r>
+              <m:r>
+                <m:rPr>
+                  <m:sty m:val="p"/>
+                </m:rPr>
+                <m:t>⋅</m:t>
+              </m:r>
+              <m:f>
+                <m:fPr>
+                  <m:type m:val="bar"/>
+                </m:fPr>
+                <m:num>
+                  <m:r>
+                    <m:t>s</m:t>
+                  </m:r>
+                </m:num>
+                <m:den>
+                  <m:rad>
+                    <m:radPr>
+                      <m:degHide m:val="on"/>
+                    </m:radPr>
+                    <m:deg/>
+                    <m:e>
+                      <m:r>
+                        <m:t>n</m:t>
+                      </m:r>
+                    </m:e>
+                  </m:rad>
+                </m:den>
+              </m:f>
+            </m:oMath>
+          </w:p>
+        </w:tc>
+      </w:tr>
+    </w:tbl>
+    <w:p>
+      <w:pPr>
+        <w:pStyle w:val="BodyText"/>
+      </w:pPr>
+      <w:r>
+        <w:t xml:space="preserve"> </w:t>
+      </w:r>
+    </w:p>
+    <w:tbl>
+      <w:tblPr>
+        <w:tblStyle w:val="Table"/>
+        <w:tblLook w:firstRow="0" w:lastRow="0" w:firstColumn="0" w:lastColumn="0" w:noHBand="0" w:noVBand="0" w:val="0000"/>
+        <w:tblBorders>
+          <w:left w:val="single" w:sz="24" w:space="0" w:color="00A047"/>
+          <w:right w:val="single" w:sz="4" w:space="0" w:color="00A047"/>
+          <w:top w:val="single" w:sz="4" w:space="0" w:color="00A047"/>
+          <w:bottom w:val="single" w:sz="4" w:space="0" w:color="00A047"/>
+        </w:tblBorders>
+        <w:tblCellMar>
+          <w:left w:w="144" w:type="dxa"/>
+          <w:right w:w="144" w:type="dxa"/>
+        </w:tblCellMar>
+        <w:tblInd w:w="164" w:type="dxa"/>
+        <w:tblW w:type="pct" w:w="100%"/>
+      </w:tblPr>
+      <w:tr>
+        <w:trPr>
+          <w:cantSplit/>
+        </w:trPr>
+        <w:tc>
+          <w:tcPr>
+            <w:shd w:color="auto" w:fill="ccf1e3" w:val="clear"/>
+            <w:tcMar>
+              <w:top w:w="92" w:type="dxa"/>
+              <w:bottom w:w="92" w:type="dxa"/>
+            </w:tcMar>
+          </w:tcPr>
+          <w:p>
+            <w:pPr>
+              <w:pStyle w:val="BodyText"/>
+            </w:pPr>
+            <w:pPr>
+              <w:spacing w:before="0" w:after="0"/>
+              <w:textAlignment w:val="center"/>
+            </w:pPr>
+            <w:r>
+              <w:drawing>
+                <wp:inline>
+                  <wp:extent cx="152400" cy="152400"/>
+                  <wp:effectExtent b="0" l="0" r="0" t="0"/>
+                  <wp:docPr descr="" title="" id="114" name="Picture"/>
+                  <a:graphic>
+                    <a:graphicData uri="http://schemas.openxmlformats.org/drawingml/2006/picture">
+                      <pic:pic>
+                        <pic:nvPicPr>
+                          <pic:cNvPr descr="/Applications/RStudio.app/Contents/Resources/app/quarto/share/formats/docx/tip.png" id="115" name="Picture"/>
+                          <pic:cNvPicPr>
+                            <a:picLocks noChangeArrowheads="1" noChangeAspect="1"/>
+                          </pic:cNvPicPr>
+                        </pic:nvPicPr>
+                        <pic:blipFill>
+                          <a:blip r:embed="rId24"/>
+                          <a:stretch>
+                            <a:fillRect/>
+                          </a:stretch>
+                        </pic:blipFill>
+                        <pic:spPr bwMode="auto">
+                          <a:xfrm>
+                            <a:off x="0" y="0"/>
+                            <a:ext cx="152400" cy="152400"/>
+                          </a:xfrm>
+                          <a:prstGeom prst="rect">
+                            <a:avLst/>
+                          </a:prstGeom>
+                          <a:noFill/>
+                          <a:ln w="9525">
+                            <a:noFill/>
+                            <a:headEnd/>
+                            <a:tailEnd/>
+                          </a:ln>
+                        </pic:spPr>
+                      </pic:pic>
+                    </a:graphicData>
+                  </a:graphic>
+                </wp:inline>
+              </w:drawing>
+            </w:r>
+            <w:r>
+              <w:t xml:space="preserve"> </w:t>
+            </w:r>
+            <w:r>
+              <w:t xml:space="preserve"> </w:t>
+            </w:r>
+            <w:r>
+              <w:t xml:space="preserve">Practice Exercise 4: Using the t-distribution</w:t>
+            </w:r>
+          </w:p>
+        </w:tc>
+      </w:tr>
+      <w:tr>
+        <w:trPr>
+          <w:cantSplit/>
+        </w:trPr>
+        <w:tc>
+          <w:tcPr>
+            <w:tcMar>
+              <w:top w:w="108" w:type="dxa"/>
+              <w:bottom w:w="108" w:type="dxa"/>
+            </w:tcMar>
+          </w:tcPr>
+          <w:p>
+            <w:pPr>
+              <w:pStyle w:val="BodyText"/>
+            </w:pPr>
+            <w:pPr>
+              <w:spacing w:before="16"/>
+            </w:pPr>
+            <w:r>
+              <w:t xml:space="preserve">Let’s compare confidence intervals using the normal approximation (z)</w:t>
+            </w:r>
+            <w:r>
+              <w:t xml:space="preserve"> </w:t>
+            </w:r>
+            <w:r>
+              <w:t xml:space="preserve">versus the t-distribution for our fish data. I3 data and 10 fish Mean is</w:t>
+            </w:r>
+            <w:r>
+              <w:t xml:space="preserve"> </w:t>
+            </w:r>
+            <w:r>
+              <w:t xml:space="preserve">266.7 - sd is 17.12 - se is 5.41</w:t>
+            </w:r>
+          </w:p>
+          <w:p>
+            <w:pPr>
+              <w:pStyle w:val="BodyText"/>
+            </w:pPr>
+            <w:r>
+              <w:t xml:space="preserve">##</w:t>
             </w:r>
             <w:r>
               <w:t xml:space="preserve"> </w:t>
@@ -5388,576 +5603,6 @@
             </w:pPr>
             <w:r>
               <w:rPr>
-                <w:rStyle w:val="NormalTok"/>
-              </w:rPr>
-              <w:t xml:space="preserve">small_sample </w:t>
-            </w:r>
-            <w:r>
-              <w:rPr>
-                <w:rStyle w:val="OtherTok"/>
-              </w:rPr>
-              <w:t xml:space="preserve">&lt;-</w:t>
-            </w:r>
-            <w:r>
-              <w:rPr>
-                <w:rStyle w:val="NormalTok"/>
-              </w:rPr>
-              <w:t xml:space="preserve"> grayling_df </w:t>
-            </w:r>
-            <w:r>
-              <w:rPr>
-                <w:rStyle w:val="SpecialCharTok"/>
-              </w:rPr>
-              <w:t xml:space="preserve">%&gt;%</w:t>
-            </w:r>
-            <w:r>
-              <w:rPr>
-                <w:rStyle w:val="NormalTok"/>
-              </w:rPr>
-              <w:t xml:space="preserve"> </w:t>
-            </w:r>
-            <w:r>
-              <w:rPr>
-                <w:rStyle w:val="FunctionTok"/>
-              </w:rPr>
-              <w:t xml:space="preserve">filter</w:t>
-            </w:r>
-            <w:r>
-              <w:rPr>
-                <w:rStyle w:val="NormalTok"/>
-              </w:rPr>
-              <w:t xml:space="preserve">(lake </w:t>
-            </w:r>
-            <w:r>
-              <w:rPr>
-                <w:rStyle w:val="SpecialCharTok"/>
-              </w:rPr>
-              <w:t xml:space="preserve">==</w:t>
-            </w:r>
-            <w:r>
-              <w:rPr>
-                <w:rStyle w:val="NormalTok"/>
-              </w:rPr>
-              <w:t xml:space="preserve"> </w:t>
-            </w:r>
-            <w:r>
-              <w:rPr>
-                <w:rStyle w:val="StringTok"/>
-              </w:rPr>
-              <w:t xml:space="preserve">"I3"</w:t>
-            </w:r>
-            <w:r>
-              <w:rPr>
-                <w:rStyle w:val="NormalTok"/>
-              </w:rPr>
-              <w:t xml:space="preserve">) </w:t>
-            </w:r>
-            <w:r>
-              <w:rPr>
-                <w:rStyle w:val="SpecialCharTok"/>
-              </w:rPr>
-              <w:t xml:space="preserve">%&gt;%</w:t>
-            </w:r>
-            <w:r>
-              <w:rPr>
-                <w:rStyle w:val="NormalTok"/>
-              </w:rPr>
-              <w:t xml:space="preserve"> </w:t>
-            </w:r>
-            <w:r>
-              <w:rPr>
-                <w:rStyle w:val="FunctionTok"/>
-              </w:rPr>
-              <w:t xml:space="preserve">slice_sample</w:t>
-            </w:r>
-            <w:r>
-              <w:rPr>
-                <w:rStyle w:val="NormalTok"/>
-              </w:rPr>
-              <w:t xml:space="preserve">(</w:t>
-            </w:r>
-            <w:r>
-              <w:rPr>
-                <w:rStyle w:val="AttributeTok"/>
-              </w:rPr>
-              <w:t xml:space="preserve">n =</w:t>
-            </w:r>
-            <w:r>
-              <w:rPr>
-                <w:rStyle w:val="NormalTok"/>
-              </w:rPr>
-              <w:t xml:space="preserve"> </w:t>
-            </w:r>
-            <w:r>
-              <w:rPr>
-                <w:rStyle w:val="DecValTok"/>
-              </w:rPr>
-              <w:t xml:space="preserve">10</w:t>
-            </w:r>
-            <w:r>
-              <w:rPr>
-                <w:rStyle w:val="NormalTok"/>
-              </w:rPr>
-              <w:t xml:space="preserve">)</w:t>
-            </w:r>
-            <w:r>
-              <w:br/>
-            </w:r>
-            <w:r>
-              <w:rPr>
-                <w:rStyle w:val="NormalTok"/>
-              </w:rPr>
-              <w:t xml:space="preserve">sample_mean </w:t>
-            </w:r>
-            <w:r>
-              <w:rPr>
-                <w:rStyle w:val="OtherTok"/>
-              </w:rPr>
-              <w:t xml:space="preserve">&lt;-</w:t>
-            </w:r>
-            <w:r>
-              <w:rPr>
-                <w:rStyle w:val="NormalTok"/>
-              </w:rPr>
-              <w:t xml:space="preserve"> </w:t>
-            </w:r>
-            <w:r>
-              <w:rPr>
-                <w:rStyle w:val="FunctionTok"/>
-              </w:rPr>
-              <w:t xml:space="preserve">mean</w:t>
-            </w:r>
-            <w:r>
-              <w:rPr>
-                <w:rStyle w:val="NormalTok"/>
-              </w:rPr>
-              <w:t xml:space="preserve">(small_sample</w:t>
-            </w:r>
-            <w:r>
-              <w:rPr>
-                <w:rStyle w:val="SpecialCharTok"/>
-              </w:rPr>
-              <w:t xml:space="preserve">$</w:t>
-            </w:r>
-            <w:r>
-              <w:rPr>
-                <w:rStyle w:val="NormalTok"/>
-              </w:rPr>
-              <w:t xml:space="preserve">length_mm)</w:t>
-            </w:r>
-            <w:r>
-              <w:br/>
-            </w:r>
-            <w:r>
-              <w:rPr>
-                <w:rStyle w:val="NormalTok"/>
-              </w:rPr>
-              <w:t xml:space="preserve">sample_sd </w:t>
-            </w:r>
-            <w:r>
-              <w:rPr>
-                <w:rStyle w:val="OtherTok"/>
-              </w:rPr>
-              <w:t xml:space="preserve">&lt;-</w:t>
-            </w:r>
-            <w:r>
-              <w:rPr>
-                <w:rStyle w:val="NormalTok"/>
-              </w:rPr>
-              <w:t xml:space="preserve"> </w:t>
-            </w:r>
-            <w:r>
-              <w:rPr>
-                <w:rStyle w:val="FunctionTok"/>
-              </w:rPr>
-              <w:t xml:space="preserve">sd</w:t>
-            </w:r>
-            <w:r>
-              <w:rPr>
-                <w:rStyle w:val="NormalTok"/>
-              </w:rPr>
-              <w:t xml:space="preserve">(small_sample</w:t>
-            </w:r>
-            <w:r>
-              <w:rPr>
-                <w:rStyle w:val="SpecialCharTok"/>
-              </w:rPr>
-              <w:t xml:space="preserve">$</w:t>
-            </w:r>
-            <w:r>
-              <w:rPr>
-                <w:rStyle w:val="NormalTok"/>
-              </w:rPr>
-              <w:t xml:space="preserve">length_mm)</w:t>
-            </w:r>
-            <w:r>
-              <w:br/>
-            </w:r>
-            <w:r>
-              <w:rPr>
-                <w:rStyle w:val="NormalTok"/>
-              </w:rPr>
-              <w:t xml:space="preserve">sample_n </w:t>
-            </w:r>
-            <w:r>
-              <w:rPr>
-                <w:rStyle w:val="OtherTok"/>
-              </w:rPr>
-              <w:t xml:space="preserve">&lt;-</w:t>
-            </w:r>
-            <w:r>
-              <w:rPr>
-                <w:rStyle w:val="NormalTok"/>
-              </w:rPr>
-              <w:t xml:space="preserve"> </w:t>
-            </w:r>
-            <w:r>
-              <w:rPr>
-                <w:rStyle w:val="FunctionTok"/>
-              </w:rPr>
-              <w:t xml:space="preserve">nrow</w:t>
-            </w:r>
-            <w:r>
-              <w:rPr>
-                <w:rStyle w:val="NormalTok"/>
-              </w:rPr>
-              <w:t xml:space="preserve">(small_sample)</w:t>
-            </w:r>
-            <w:r>
-              <w:br/>
-            </w:r>
-            <w:r>
-              <w:rPr>
-                <w:rStyle w:val="NormalTok"/>
-              </w:rPr>
-              <w:t xml:space="preserve">sample_se </w:t>
-            </w:r>
-            <w:r>
-              <w:rPr>
-                <w:rStyle w:val="OtherTok"/>
-              </w:rPr>
-              <w:t xml:space="preserve">&lt;-</w:t>
-            </w:r>
-            <w:r>
-              <w:rPr>
-                <w:rStyle w:val="NormalTok"/>
-              </w:rPr>
-              <w:t xml:space="preserve"> sample_sd </w:t>
-            </w:r>
-            <w:r>
-              <w:rPr>
-                <w:rStyle w:val="SpecialCharTok"/>
-              </w:rPr>
-              <w:t xml:space="preserve">/</w:t>
-            </w:r>
-            <w:r>
-              <w:rPr>
-                <w:rStyle w:val="NormalTok"/>
-              </w:rPr>
-              <w:t xml:space="preserve"> </w:t>
-            </w:r>
-            <w:r>
-              <w:rPr>
-                <w:rStyle w:val="FunctionTok"/>
-              </w:rPr>
-              <w:t xml:space="preserve">sqrt</w:t>
-            </w:r>
-            <w:r>
-              <w:rPr>
-                <w:rStyle w:val="NormalTok"/>
-              </w:rPr>
-              <w:t xml:space="preserve">(sample_n)</w:t>
-            </w:r>
-            <w:r>
-              <w:br/>
-            </w:r>
-            <w:r>
-              <w:rPr>
-                <w:rStyle w:val="NormalTok"/>
-              </w:rPr>
-              <w:t xml:space="preserve">z_ci_lower </w:t>
-            </w:r>
-            <w:r>
-              <w:rPr>
-                <w:rStyle w:val="OtherTok"/>
-              </w:rPr>
-              <w:t xml:space="preserve">&lt;-</w:t>
-            </w:r>
-            <w:r>
-              <w:rPr>
-                <w:rStyle w:val="NormalTok"/>
-              </w:rPr>
-              <w:t xml:space="preserve"> sample_mean </w:t>
-            </w:r>
-            <w:r>
-              <w:rPr>
-                <w:rStyle w:val="SpecialCharTok"/>
-              </w:rPr>
-              <w:t xml:space="preserve">-</w:t>
-            </w:r>
-            <w:r>
-              <w:rPr>
-                <w:rStyle w:val="NormalTok"/>
-              </w:rPr>
-              <w:t xml:space="preserve"> </w:t>
-            </w:r>
-            <w:r>
-              <w:rPr>
-                <w:rStyle w:val="FloatTok"/>
-              </w:rPr>
-              <w:t xml:space="preserve">1.96</w:t>
-            </w:r>
-            <w:r>
-              <w:rPr>
-                <w:rStyle w:val="NormalTok"/>
-              </w:rPr>
-              <w:t xml:space="preserve"> </w:t>
-            </w:r>
-            <w:r>
-              <w:rPr>
-                <w:rStyle w:val="SpecialCharTok"/>
-              </w:rPr>
-              <w:t xml:space="preserve">*</w:t>
-            </w:r>
-            <w:r>
-              <w:rPr>
-                <w:rStyle w:val="NormalTok"/>
-              </w:rPr>
-              <w:t xml:space="preserve"> sample_se</w:t>
-            </w:r>
-            <w:r>
-              <w:br/>
-            </w:r>
-            <w:r>
-              <w:rPr>
-                <w:rStyle w:val="NormalTok"/>
-              </w:rPr>
-              <w:t xml:space="preserve">z_ci_upper </w:t>
-            </w:r>
-            <w:r>
-              <w:rPr>
-                <w:rStyle w:val="OtherTok"/>
-              </w:rPr>
-              <w:t xml:space="preserve">&lt;-</w:t>
-            </w:r>
-            <w:r>
-              <w:rPr>
-                <w:rStyle w:val="NormalTok"/>
-              </w:rPr>
-              <w:t xml:space="preserve"> sample_mean </w:t>
-            </w:r>
-            <w:r>
-              <w:rPr>
-                <w:rStyle w:val="SpecialCharTok"/>
-              </w:rPr>
-              <w:t xml:space="preserve">+</w:t>
-            </w:r>
-            <w:r>
-              <w:rPr>
-                <w:rStyle w:val="NormalTok"/>
-              </w:rPr>
-              <w:t xml:space="preserve"> </w:t>
-            </w:r>
-            <w:r>
-              <w:rPr>
-                <w:rStyle w:val="FloatTok"/>
-              </w:rPr>
-              <w:t xml:space="preserve">1.96</w:t>
-            </w:r>
-            <w:r>
-              <w:rPr>
-                <w:rStyle w:val="NormalTok"/>
-              </w:rPr>
-              <w:t xml:space="preserve"> </w:t>
-            </w:r>
-            <w:r>
-              <w:rPr>
-                <w:rStyle w:val="SpecialCharTok"/>
-              </w:rPr>
-              <w:t xml:space="preserve">*</w:t>
-            </w:r>
-            <w:r>
-              <w:rPr>
-                <w:rStyle w:val="NormalTok"/>
-              </w:rPr>
-              <w:t xml:space="preserve"> sample_se</w:t>
-            </w:r>
-            <w:r>
-              <w:br/>
-            </w:r>
-            <w:r>
-              <w:rPr>
-                <w:rStyle w:val="NormalTok"/>
-              </w:rPr>
-              <w:t xml:space="preserve">t_crit </w:t>
-            </w:r>
-            <w:r>
-              <w:rPr>
-                <w:rStyle w:val="OtherTok"/>
-              </w:rPr>
-              <w:t xml:space="preserve">&lt;-</w:t>
-            </w:r>
-            <w:r>
-              <w:rPr>
-                <w:rStyle w:val="NormalTok"/>
-              </w:rPr>
-              <w:t xml:space="preserve"> </w:t>
-            </w:r>
-            <w:r>
-              <w:rPr>
-                <w:rStyle w:val="FunctionTok"/>
-              </w:rPr>
-              <w:t xml:space="preserve">qt</w:t>
-            </w:r>
-            <w:r>
-              <w:rPr>
-                <w:rStyle w:val="NormalTok"/>
-              </w:rPr>
-              <w:t xml:space="preserve">(</w:t>
-            </w:r>
-            <w:r>
-              <w:rPr>
-                <w:rStyle w:val="FloatTok"/>
-              </w:rPr>
-              <w:t xml:space="preserve">0.975</w:t>
-            </w:r>
-            <w:r>
-              <w:rPr>
-                <w:rStyle w:val="NormalTok"/>
-              </w:rPr>
-              <w:t xml:space="preserve">, </w:t>
-            </w:r>
-            <w:r>
-              <w:rPr>
-                <w:rStyle w:val="AttributeTok"/>
-              </w:rPr>
-              <w:t xml:space="preserve">df =</w:t>
-            </w:r>
-            <w:r>
-              <w:rPr>
-                <w:rStyle w:val="NormalTok"/>
-              </w:rPr>
-              <w:t xml:space="preserve"> sample_n </w:t>
-            </w:r>
-            <w:r>
-              <w:rPr>
-                <w:rStyle w:val="SpecialCharTok"/>
-              </w:rPr>
-              <w:t xml:space="preserve">-</w:t>
-            </w:r>
-            <w:r>
-              <w:rPr>
-                <w:rStyle w:val="NormalTok"/>
-              </w:rPr>
-              <w:t xml:space="preserve"> </w:t>
-            </w:r>
-            <w:r>
-              <w:rPr>
-                <w:rStyle w:val="DecValTok"/>
-              </w:rPr>
-              <w:t xml:space="preserve">1</w:t>
-            </w:r>
-            <w:r>
-              <w:rPr>
-                <w:rStyle w:val="NormalTok"/>
-              </w:rPr>
-              <w:t xml:space="preserve">)</w:t>
-            </w:r>
-            <w:r>
-              <w:br/>
-            </w:r>
-            <w:r>
-              <w:rPr>
-                <w:rStyle w:val="NormalTok"/>
-              </w:rPr>
-              <w:t xml:space="preserve">t_ci_lower </w:t>
-            </w:r>
-            <w:r>
-              <w:rPr>
-                <w:rStyle w:val="OtherTok"/>
-              </w:rPr>
-              <w:t xml:space="preserve">&lt;-</w:t>
-            </w:r>
-            <w:r>
-              <w:rPr>
-                <w:rStyle w:val="NormalTok"/>
-              </w:rPr>
-              <w:t xml:space="preserve"> sample_mean </w:t>
-            </w:r>
-            <w:r>
-              <w:rPr>
-                <w:rStyle w:val="SpecialCharTok"/>
-              </w:rPr>
-              <w:t xml:space="preserve">-</w:t>
-            </w:r>
-            <w:r>
-              <w:rPr>
-                <w:rStyle w:val="NormalTok"/>
-              </w:rPr>
-              <w:t xml:space="preserve"> t_crit </w:t>
-            </w:r>
-            <w:r>
-              <w:rPr>
-                <w:rStyle w:val="SpecialCharTok"/>
-              </w:rPr>
-              <w:t xml:space="preserve">*</w:t>
-            </w:r>
-            <w:r>
-              <w:rPr>
-                <w:rStyle w:val="NormalTok"/>
-              </w:rPr>
-              <w:t xml:space="preserve"> sample_se</w:t>
-            </w:r>
-            <w:r>
-              <w:br/>
-            </w:r>
-            <w:r>
-              <w:rPr>
-                <w:rStyle w:val="NormalTok"/>
-              </w:rPr>
-              <w:t xml:space="preserve">t_ci_upper </w:t>
-            </w:r>
-            <w:r>
-              <w:rPr>
-                <w:rStyle w:val="OtherTok"/>
-              </w:rPr>
-              <w:t xml:space="preserve">&lt;-</w:t>
-            </w:r>
-            <w:r>
-              <w:rPr>
-                <w:rStyle w:val="NormalTok"/>
-              </w:rPr>
-              <w:t xml:space="preserve"> sample_mean </w:t>
-            </w:r>
-            <w:r>
-              <w:rPr>
-                <w:rStyle w:val="SpecialCharTok"/>
-              </w:rPr>
-              <w:t xml:space="preserve">+</w:t>
-            </w:r>
-            <w:r>
-              <w:rPr>
-                <w:rStyle w:val="NormalTok"/>
-              </w:rPr>
-              <w:t xml:space="preserve"> t_crit </w:t>
-            </w:r>
-            <w:r>
-              <w:rPr>
-                <w:rStyle w:val="SpecialCharTok"/>
-              </w:rPr>
-              <w:t xml:space="preserve">*</w:t>
-            </w:r>
-            <w:r>
-              <w:rPr>
-                <w:rStyle w:val="NormalTok"/>
-              </w:rPr>
-              <w:t xml:space="preserve"> sample_se</w:t>
-            </w:r>
-            <w:r>
-              <w:br/>
-            </w:r>
-            <w:r>
-              <w:rPr>
                 <w:rStyle w:val="CommentTok"/>
               </w:rPr>
               <w:t xml:space="preserve"># Display results</w:t>
@@ -6046,7 +5691,7 @@
               <w:rPr>
                 <w:rStyle w:val="VerbatimChar"/>
               </w:rPr>
-              <w:t xml:space="preserve">Mean: 280 mm</w:t>
+              <w:t xml:space="preserve">Mean: 245.6 mm</w:t>
             </w:r>
           </w:p>
           <w:p>
@@ -6134,7 +5779,7 @@
               <w:rPr>
                 <w:rStyle w:val="VerbatimChar"/>
               </w:rPr>
-              <w:t xml:space="preserve">Standard deviation: 19.56 mm</w:t>
+              <w:t xml:space="preserve">Standard deviation: 37.3 mm</w:t>
             </w:r>
           </w:p>
           <w:p>
@@ -6222,7 +5867,7 @@
               <w:rPr>
                 <w:rStyle w:val="VerbatimChar"/>
               </w:rPr>
-              <w:t xml:space="preserve">Standard error: 6.18 mm</w:t>
+              <w:t xml:space="preserve">Standard error: 11.79 mm</w:t>
             </w:r>
           </w:p>
           <w:p>
@@ -6346,7 +5991,7 @@
               <w:rPr>
                 <w:rStyle w:val="VerbatimChar"/>
               </w:rPr>
-              <w:t xml:space="preserve">95% CI using z: 267.9 to 292.1 mm</w:t>
+              <w:t xml:space="preserve">95% CI using z: 222.5 to 268.7 mm</w:t>
             </w:r>
           </w:p>
           <w:p>
@@ -6470,7 +6115,7 @@
               <w:rPr>
                 <w:rStyle w:val="VerbatimChar"/>
               </w:rPr>
-              <w:t xml:space="preserve">95% CI using t: 266 to 294 mm</w:t>
+              <w:t xml:space="preserve">95% CI using t: 218.9 to 272.3 mm</w:t>
             </w:r>
           </w:p>
           <w:p>
@@ -6564,8 +6209,8 @@
         </w:tc>
       </w:tr>
     </w:tbl>
-    <w:bookmarkEnd w:id="114"/>
-    <w:bookmarkStart w:id="115" w:name="X194f6ce4be61c2f7de25bca00683bc72761ab22"/>
+    <w:bookmarkEnd w:id="116"/>
+    <w:bookmarkStart w:id="117" w:name="X194f6ce4be61c2f7de25bca00683bc72761ab22"/>
     <w:p>
       <w:pPr>
         <w:pStyle w:val="Heading1"/>
@@ -6882,8 +6527,8 @@
         <w:t xml:space="preserve">Decision: Reject Ho (sample mean falls in upper rejection region)</w:t>
       </w:r>
     </w:p>
-    <w:bookmarkEnd w:id="115"/>
-    <w:bookmarkStart w:id="119" w:name="X673d7bb62bfbe83a28b60eed942fc852a091155"/>
+    <w:bookmarkEnd w:id="117"/>
+    <w:bookmarkStart w:id="121" w:name="X673d7bb62bfbe83a28b60eed942fc852a091155"/>
     <w:p>
       <w:pPr>
         <w:pStyle w:val="Heading1"/>
@@ -7099,18 +6744,18 @@
           <wp:inline>
             <wp:extent cx="4572000" cy="4572000"/>
             <wp:effectExtent b="0" l="0" r="0" t="0"/>
-            <wp:docPr descr="" title="" id="117" name="Picture"/>
+            <wp:docPr descr="" title="" id="119" name="Picture"/>
             <a:graphic>
               <a:graphicData uri="http://schemas.openxmlformats.org/drawingml/2006/picture">
                 <pic:pic>
                   <pic:nvPicPr>
-                    <pic:cNvPr descr="04_01_lecture_powerpoint_files/figure-docx/unnamed-chunk-16-1.png" id="118" name="Picture"/>
+                    <pic:cNvPr descr="04_01_lecture_powerpoint_files/figure-docx/unnamed-chunk-17-1.png" id="120" name="Picture"/>
                     <pic:cNvPicPr>
                       <a:picLocks noChangeArrowheads="1" noChangeAspect="1"/>
                     </pic:cNvPicPr>
                   </pic:nvPicPr>
                   <pic:blipFill>
-                    <a:blip r:embed="rId116"/>
+                    <a:blip r:embed="rId118"/>
                     <a:stretch>
                       <a:fillRect/>
                     </a:stretch>
@@ -7137,15 +6782,15 @@
         </w:drawing>
       </w:r>
     </w:p>
-    <w:bookmarkEnd w:id="119"/>
-    <w:bookmarkStart w:id="120" w:name="section"/>
+    <w:bookmarkEnd w:id="121"/>
+    <w:bookmarkStart w:id="122" w:name="section"/>
     <w:p>
       <w:pPr>
         <w:pStyle w:val="Heading1"/>
       </w:pPr>
     </w:p>
-    <w:bookmarkEnd w:id="120"/>
-    <w:bookmarkStart w:id="121" w:name="lecture-4-hypothesis-testing-two-tailed"/>
+    <w:bookmarkEnd w:id="122"/>
+    <w:bookmarkStart w:id="123" w:name="lecture-4-hypothesis-testing-two-tailed"/>
     <w:p>
       <w:pPr>
         <w:pStyle w:val="Heading1"/>
@@ -7441,8 +7086,8 @@
         <w:t xml:space="preserve">Decision: Reject Ho (sample mean falls in rejection region)</w:t>
       </w:r>
     </w:p>
-    <w:bookmarkEnd w:id="121"/>
-    <w:bookmarkStart w:id="125" w:name="X29a921c8a2bb7d4d22ca8005c6592b72821a36a"/>
+    <w:bookmarkEnd w:id="123"/>
+    <w:bookmarkStart w:id="127" w:name="X29a921c8a2bb7d4d22ca8005c6592b72821a36a"/>
     <w:p>
       <w:pPr>
         <w:pStyle w:val="Heading1"/>
@@ -7656,18 +7301,18 @@
           <wp:inline>
             <wp:extent cx="4572000" cy="4572000"/>
             <wp:effectExtent b="0" l="0" r="0" t="0"/>
-            <wp:docPr descr="" title="" id="123" name="Picture"/>
+            <wp:docPr descr="" title="" id="125" name="Picture"/>
             <a:graphic>
               <a:graphicData uri="http://schemas.openxmlformats.org/drawingml/2006/picture">
                 <pic:pic>
                   <pic:nvPicPr>
-                    <pic:cNvPr descr="04_01_lecture_powerpoint_files/figure-docx/unnamed-chunk-18-1.png" id="124" name="Picture"/>
+                    <pic:cNvPr descr="04_01_lecture_powerpoint_files/figure-docx/unnamed-chunk-19-1.png" id="126" name="Picture"/>
                     <pic:cNvPicPr>
                       <a:picLocks noChangeArrowheads="1" noChangeAspect="1"/>
                     </pic:cNvPicPr>
                   </pic:nvPicPr>
                   <pic:blipFill>
-                    <a:blip r:embed="rId122"/>
+                    <a:blip r:embed="rId124"/>
                     <a:stretch>
                       <a:fillRect/>
                     </a:stretch>
@@ -7694,8 +7339,8 @@
         </w:drawing>
       </w:r>
     </w:p>
-    <w:bookmarkEnd w:id="125"/>
-    <w:bookmarkStart w:id="128" w:name="practice-exercise-5-one-sample-t-test"/>
+    <w:bookmarkEnd w:id="127"/>
+    <w:bookmarkStart w:id="130" w:name="practice-exercise-5-one-sample-t-test"/>
     <w:p>
       <w:pPr>
         <w:pStyle w:val="Heading1"/>
@@ -7746,12 +7391,12 @@
                 <wp:inline>
                   <wp:extent cx="152400" cy="152400"/>
                   <wp:effectExtent b="0" l="0" r="0" t="0"/>
-                  <wp:docPr descr="" title="" id="126" name="Picture"/>
+                  <wp:docPr descr="" title="" id="128" name="Picture"/>
                   <a:graphic>
                     <a:graphicData uri="http://schemas.openxmlformats.org/drawingml/2006/picture">
                       <pic:pic>
                         <pic:nvPicPr>
-                          <pic:cNvPr descr="/Applications/RStudio.app/Contents/Resources/app/quarto/share/formats/docx/tip.png" id="127" name="Picture"/>
+                          <pic:cNvPr descr="/Applications/RStudio.app/Contents/Resources/app/quarto/share/formats/docx/tip.png" id="129" name="Picture"/>
                           <pic:cNvPicPr>
                             <a:picLocks noChangeArrowheads="1" noChangeAspect="1"/>
                           </pic:cNvPicPr>
@@ -8325,8 +7970,8 @@
         </w:tc>
       </w:tr>
     </w:tbl>
-    <w:bookmarkEnd w:id="128"/>
-    <w:bookmarkStart w:id="131" w:name="X3067b548be1e04e40e4a065616f256b8a6f8e52"/>
+    <w:bookmarkEnd w:id="130"/>
+    <w:bookmarkStart w:id="133" w:name="X3067b548be1e04e40e4a065616f256b8a6f8e52"/>
     <w:p>
       <w:pPr>
         <w:pStyle w:val="Heading1"/>
@@ -8377,12 +8022,12 @@
                 <wp:inline>
                   <wp:extent cx="152400" cy="152400"/>
                   <wp:effectExtent b="0" l="0" r="0" t="0"/>
-                  <wp:docPr descr="" title="" id="129" name="Picture"/>
+                  <wp:docPr descr="" title="" id="131" name="Picture"/>
                   <a:graphic>
                     <a:graphicData uri="http://schemas.openxmlformats.org/drawingml/2006/picture">
                       <pic:pic>
                         <pic:nvPicPr>
-                          <pic:cNvPr descr="/Applications/RStudio.app/Contents/Resources/app/quarto/share/formats/docx/tip.png" id="130" name="Picture"/>
+                          <pic:cNvPr descr="/Applications/RStudio.app/Contents/Resources/app/quarto/share/formats/docx/tip.png" id="132" name="Picture"/>
                           <pic:cNvPicPr>
                             <a:picLocks noChangeArrowheads="1" noChangeAspect="1"/>
                           </pic:cNvPicPr>
@@ -8715,8 +8360,8 @@
         </w:tc>
       </w:tr>
     </w:tbl>
-    <w:bookmarkEnd w:id="131"/>
-    <w:bookmarkStart w:id="135" w:name="lecture-4-understanding-p-values"/>
+    <w:bookmarkEnd w:id="133"/>
+    <w:bookmarkStart w:id="137" w:name="lecture-4-understanding-p-values"/>
     <w:p>
       <w:pPr>
         <w:pStyle w:val="Heading1"/>
@@ -8888,18 +8533,18 @@
           <wp:inline>
             <wp:extent cx="4572000" cy="3657600"/>
             <wp:effectExtent b="0" l="0" r="0" t="0"/>
-            <wp:docPr descr="" title="" id="133" name="Picture"/>
+            <wp:docPr descr="" title="" id="135" name="Picture"/>
             <a:graphic>
               <a:graphicData uri="http://schemas.openxmlformats.org/drawingml/2006/picture">
                 <pic:pic>
                   <pic:nvPicPr>
-                    <pic:cNvPr descr="04_01_lecture_powerpoint_files/figure-docx/unnamed-chunk-21-1.png" id="134" name="Picture"/>
+                    <pic:cNvPr descr="04_01_lecture_powerpoint_files/figure-docx/unnamed-chunk-22-1.png" id="136" name="Picture"/>
                     <pic:cNvPicPr>
                       <a:picLocks noChangeArrowheads="1" noChangeAspect="1"/>
                     </pic:cNvPicPr>
                   </pic:nvPicPr>
                   <pic:blipFill>
-                    <a:blip r:embed="rId132"/>
+                    <a:blip r:embed="rId134"/>
                     <a:stretch>
                       <a:fillRect/>
                     </a:stretch>
@@ -8926,8 +8571,8 @@
         </w:drawing>
       </w:r>
     </w:p>
-    <w:bookmarkEnd w:id="135"/>
-    <w:bookmarkStart w:id="139" w:name="lecture-4-type-i-and-type-ii-errors"/>
+    <w:bookmarkEnd w:id="137"/>
+    <w:bookmarkStart w:id="141" w:name="lecture-4-type-i-and-type-ii-errors"/>
     <w:p>
       <w:pPr>
         <w:pStyle w:val="Heading1"/>
@@ -9145,18 +8790,18 @@
           <wp:inline>
             <wp:extent cx="4572000" cy="4572000"/>
             <wp:effectExtent b="0" l="0" r="0" t="0"/>
-            <wp:docPr descr="" title="" id="137" name="Picture"/>
+            <wp:docPr descr="" title="" id="139" name="Picture"/>
             <a:graphic>
               <a:graphicData uri="http://schemas.openxmlformats.org/drawingml/2006/picture">
                 <pic:pic>
                   <pic:nvPicPr>
-                    <pic:cNvPr descr="04_01_lecture_powerpoint_files/figure-docx/unnamed-chunk-22-1.png" id="138" name="Picture"/>
+                    <pic:cNvPr descr="04_01_lecture_powerpoint_files/figure-docx/unnamed-chunk-23-1.png" id="140" name="Picture"/>
                     <pic:cNvPicPr>
                       <a:picLocks noChangeArrowheads="1" noChangeAspect="1"/>
                     </pic:cNvPicPr>
                   </pic:nvPicPr>
                   <pic:blipFill>
-                    <a:blip r:embed="rId136"/>
+                    <a:blip r:embed="rId138"/>
                     <a:stretch>
                       <a:fillRect/>
                     </a:stretch>
@@ -9183,8 +8828,8 @@
         </w:drawing>
       </w:r>
     </w:p>
-    <w:bookmarkEnd w:id="139"/>
-    <w:bookmarkStart w:id="143" w:name="lecture-4-type-i-and-type-ii-errors-1"/>
+    <w:bookmarkEnd w:id="141"/>
+    <w:bookmarkStart w:id="145" w:name="lecture-4-type-i-and-type-ii-errors-1"/>
     <w:p>
       <w:pPr>
         <w:pStyle w:val="Heading1"/>
@@ -9398,18 +9043,18 @@
           <wp:inline>
             <wp:extent cx="4572000" cy="4572000"/>
             <wp:effectExtent b="0" l="0" r="0" t="0"/>
-            <wp:docPr descr="" title="" id="141" name="Picture"/>
+            <wp:docPr descr="" title="" id="143" name="Picture"/>
             <a:graphic>
               <a:graphicData uri="http://schemas.openxmlformats.org/drawingml/2006/picture">
                 <pic:pic>
                   <pic:nvPicPr>
-                    <pic:cNvPr descr="04_01_lecture_powerpoint_files/figure-docx/unnamed-chunk-23-1.png" id="142" name="Picture"/>
+                    <pic:cNvPr descr="04_01_lecture_powerpoint_files/figure-docx/unnamed-chunk-24-1.png" id="144" name="Picture"/>
                     <pic:cNvPicPr>
                       <a:picLocks noChangeArrowheads="1" noChangeAspect="1"/>
                     </pic:cNvPicPr>
                   </pic:nvPicPr>
                   <pic:blipFill>
-                    <a:blip r:embed="rId140"/>
+                    <a:blip r:embed="rId142"/>
                     <a:stretch>
                       <a:fillRect/>
                     </a:stretch>
@@ -9436,15 +9081,15 @@
         </w:drawing>
       </w:r>
     </w:p>
-    <w:bookmarkEnd w:id="143"/>
-    <w:bookmarkStart w:id="144" w:name="section-1"/>
+    <w:bookmarkEnd w:id="145"/>
+    <w:bookmarkStart w:id="146" w:name="section-1"/>
     <w:p>
       <w:pPr>
         <w:pStyle w:val="Heading1"/>
       </w:pPr>
     </w:p>
-    <w:bookmarkEnd w:id="144"/>
-    <w:bookmarkStart w:id="147" w:name="Xb978d4759940b7502e06ce02d94a39bb9acbc9d"/>
+    <w:bookmarkEnd w:id="146"/>
+    <w:bookmarkStart w:id="149" w:name="Xb978d4759940b7502e06ce02d94a39bb9acbc9d"/>
     <w:p>
       <w:pPr>
         <w:pStyle w:val="Heading1"/>
@@ -9495,12 +9140,12 @@
                 <wp:inline>
                   <wp:extent cx="152400" cy="152400"/>
                   <wp:effectExtent b="0" l="0" r="0" t="0"/>
-                  <wp:docPr descr="" title="" id="145" name="Picture"/>
+                  <wp:docPr descr="" title="" id="147" name="Picture"/>
                   <a:graphic>
                     <a:graphicData uri="http://schemas.openxmlformats.org/drawingml/2006/picture">
                       <pic:pic>
                         <pic:nvPicPr>
-                          <pic:cNvPr descr="/Applications/RStudio.app/Contents/Resources/app/quarto/share/formats/docx/tip.png" id="146" name="Picture"/>
+                          <pic:cNvPr descr="/Applications/RStudio.app/Contents/Resources/app/quarto/share/formats/docx/tip.png" id="148" name="Picture"/>
                           <pic:cNvPicPr>
                             <a:picLocks noChangeArrowheads="1" noChangeAspect="1"/>
                           </pic:cNvPicPr>
@@ -10509,8 +10154,8 @@
         </w:tc>
       </w:tr>
     </w:tbl>
-    <w:bookmarkEnd w:id="147"/>
-    <w:bookmarkStart w:id="151" w:name="lecture-4-summary"/>
+    <w:bookmarkEnd w:id="149"/>
+    <w:bookmarkStart w:id="153" w:name="lecture-4-summary"/>
     <w:p>
       <w:pPr>
         <w:pStyle w:val="Heading1"/>
@@ -10755,18 +10400,18 @@
           <wp:inline>
             <wp:extent cx="4572000" cy="4572000"/>
             <wp:effectExtent b="0" l="0" r="0" t="0"/>
-            <wp:docPr descr="" title="" id="149" name="Picture"/>
+            <wp:docPr descr="" title="" id="151" name="Picture"/>
             <a:graphic>
               <a:graphicData uri="http://schemas.openxmlformats.org/drawingml/2006/picture">
                 <pic:pic>
                   <pic:nvPicPr>
-                    <pic:cNvPr descr="04_01_lecture_powerpoint_files/figure-docx/unnamed-chunk-25-1.png" id="150" name="Picture"/>
+                    <pic:cNvPr descr="04_01_lecture_powerpoint_files/figure-docx/unnamed-chunk-26-1.png" id="152" name="Picture"/>
                     <pic:cNvPicPr>
                       <a:picLocks noChangeArrowheads="1" noChangeAspect="1"/>
                     </pic:cNvPicPr>
                   </pic:nvPicPr>
                   <pic:blipFill>
-                    <a:blip r:embed="rId148"/>
+                    <a:blip r:embed="rId150"/>
                     <a:stretch>
                       <a:fillRect/>
                     </a:stretch>
@@ -10793,7 +10438,7 @@
         </w:drawing>
       </w:r>
     </w:p>
-    <w:bookmarkEnd w:id="151"/>
+    <w:bookmarkEnd w:id="153"/>
     <w:sectPr>
       <w:pgSz w:h="15840" w:w="12240"/>
       <w:pgMar w:bottom="720" w:footer="720" w:gutter="0" w:header="720" w:left="1152" w:right="720" w:top="720"/>

</xml_diff>